<commit_message>
renames and some cyber stuff
</commit_message>
<xml_diff>
--- a/Communications/Enterprise Software Maintenance.docx
+++ b/Communications/Enterprise Software Maintenance.docx
@@ -67,19 +67,7 @@
         <w:rPr>
           <w:rFonts w:ascii="Times New Roman" w:hAnsi="Times New Roman" w:cs="Times New Roman"/>
         </w:rPr>
-        <w:t>Managing Technical Debt and Modernizing Legacy Monoliths</w:t>
-      </w:r>
-      <w:r>
-        <w:rPr>
-          <w:rFonts w:ascii="Times New Roman" w:hAnsi="Times New Roman" w:cs="Times New Roman"/>
-        </w:rPr>
-        <w:t xml:space="preserve"> </w:t>
-      </w:r>
-      <w:r>
-        <w:rPr>
-          <w:rFonts w:ascii="Times New Roman" w:hAnsi="Times New Roman" w:cs="Times New Roman"/>
-        </w:rPr>
-        <w:t>Amidst a Shrinking Workforce of Legacy Developers</w:t>
+        <w:t>Managing Technical Debt and Modernizing Legacy Monoliths Amidst a Shrinking Workforce of Legacy Developers</w:t>
       </w:r>
     </w:p>
     <w:p>
@@ -304,669 +292,53 @@
         <w:rPr>
           <w:rFonts w:ascii="Times New Roman" w:hAnsi="Times New Roman" w:cs="Times New Roman"/>
         </w:rPr>
-        <w:t>Executive Summary .........................................</w:t>
-      </w:r>
-      <w:r>
-        <w:rPr>
-          <w:rFonts w:ascii="Times New Roman" w:hAnsi="Times New Roman" w:cs="Times New Roman"/>
-        </w:rPr>
-        <w:t>...........................................................</w:t>
-      </w:r>
-      <w:r>
-        <w:rPr>
-          <w:rFonts w:ascii="Times New Roman" w:hAnsi="Times New Roman" w:cs="Times New Roman"/>
-        </w:rPr>
-        <w:t>..................  3</w:t>
-      </w:r>
-    </w:p>
-    <w:p>
-      <w:pPr>
-        <w:spacing w:line="480" w:lineRule="auto"/>
-        <w:contextualSpacing/>
-        <w:rPr>
-          <w:rFonts w:ascii="Times New Roman" w:hAnsi="Times New Roman" w:cs="Times New Roman"/>
-        </w:rPr>
-      </w:pPr>
-    </w:p>
-    <w:p>
-      <w:pPr>
-        <w:spacing w:line="480" w:lineRule="auto"/>
-        <w:contextualSpacing/>
-        <w:rPr>
-          <w:rFonts w:ascii="Times New Roman" w:hAnsi="Times New Roman" w:cs="Times New Roman"/>
-        </w:rPr>
-      </w:pPr>
-      <w:r>
-        <w:rPr>
-          <w:rFonts w:ascii="Times New Roman" w:hAnsi="Times New Roman" w:cs="Times New Roman"/>
-        </w:rPr>
-        <w:t>1. Introduction .............................</w:t>
-      </w:r>
-      <w:r>
-        <w:rPr>
-          <w:rFonts w:ascii="Times New Roman" w:hAnsi="Times New Roman" w:cs="Times New Roman"/>
-        </w:rPr>
-        <w:t>..................................................................</w:t>
-      </w:r>
-      <w:r>
-        <w:rPr>
-          <w:rFonts w:ascii="Times New Roman" w:hAnsi="Times New Roman" w:cs="Times New Roman"/>
-        </w:rPr>
-        <w:t>................................  4</w:t>
-      </w:r>
-    </w:p>
-    <w:p>
-      <w:pPr>
-        <w:spacing w:line="480" w:lineRule="auto"/>
-        <w:contextualSpacing/>
-        <w:rPr>
-          <w:rFonts w:ascii="Times New Roman" w:hAnsi="Times New Roman" w:cs="Times New Roman"/>
-        </w:rPr>
-      </w:pPr>
-      <w:r>
-        <w:rPr>
-          <w:rFonts w:ascii="Times New Roman" w:hAnsi="Times New Roman" w:cs="Times New Roman"/>
-        </w:rPr>
-        <w:t xml:space="preserve">   1.1 Definition and Scope of Enterprise Software Maintenance ........</w:t>
-      </w:r>
-      <w:r>
-        <w:rPr>
-          <w:rFonts w:ascii="Times New Roman" w:hAnsi="Times New Roman" w:cs="Times New Roman"/>
-        </w:rPr>
-        <w:t>...................................</w:t>
-      </w:r>
-      <w:r>
-        <w:rPr>
-          <w:rFonts w:ascii="Times New Roman" w:hAnsi="Times New Roman" w:cs="Times New Roman"/>
-        </w:rPr>
-        <w:t>......  4</w:t>
-      </w:r>
-    </w:p>
-    <w:p>
-      <w:pPr>
-        <w:spacing w:line="480" w:lineRule="auto"/>
-        <w:contextualSpacing/>
-        <w:rPr>
-          <w:rFonts w:ascii="Times New Roman" w:hAnsi="Times New Roman" w:cs="Times New Roman"/>
-        </w:rPr>
-      </w:pPr>
-      <w:r>
-        <w:rPr>
-          <w:rFonts w:ascii="Times New Roman" w:hAnsi="Times New Roman" w:cs="Times New Roman"/>
-        </w:rPr>
-        <w:t xml:space="preserve">   1.2 The Growing Burden of Technical Debt </w:t>
-      </w:r>
-      <w:r>
-        <w:rPr>
-          <w:rFonts w:ascii="Times New Roman" w:hAnsi="Times New Roman" w:cs="Times New Roman"/>
-        </w:rPr>
-        <w:t>……………………………………………………</w:t>
-      </w:r>
-      <w:r>
-        <w:rPr>
-          <w:rFonts w:ascii="Times New Roman" w:hAnsi="Times New Roman" w:cs="Times New Roman"/>
-        </w:rPr>
-        <w:t>4</w:t>
-      </w:r>
-    </w:p>
-    <w:p>
-      <w:pPr>
-        <w:spacing w:line="480" w:lineRule="auto"/>
-        <w:contextualSpacing/>
-        <w:rPr>
-          <w:rFonts w:ascii="Times New Roman" w:hAnsi="Times New Roman" w:cs="Times New Roman"/>
-        </w:rPr>
-      </w:pPr>
-      <w:r>
-        <w:rPr>
-          <w:rFonts w:ascii="Times New Roman" w:hAnsi="Times New Roman" w:cs="Times New Roman"/>
-        </w:rPr>
-        <w:t xml:space="preserve">   1.3 Research Question .......................</w:t>
-      </w:r>
-      <w:r>
-        <w:rPr>
-          <w:rFonts w:ascii="Times New Roman" w:hAnsi="Times New Roman" w:cs="Times New Roman"/>
-        </w:rPr>
-        <w:t>...........................................................</w:t>
-      </w:r>
-      <w:r>
-        <w:rPr>
-          <w:rFonts w:ascii="Times New Roman" w:hAnsi="Times New Roman" w:cs="Times New Roman"/>
-        </w:rPr>
-        <w:t>.............................  4</w:t>
-      </w:r>
-    </w:p>
-    <w:p>
-      <w:pPr>
-        <w:spacing w:line="480" w:lineRule="auto"/>
-        <w:contextualSpacing/>
-        <w:rPr>
-          <w:rFonts w:ascii="Times New Roman" w:hAnsi="Times New Roman" w:cs="Times New Roman"/>
-        </w:rPr>
-      </w:pPr>
-    </w:p>
-    <w:p>
-      <w:pPr>
-        <w:spacing w:line="480" w:lineRule="auto"/>
-        <w:contextualSpacing/>
-        <w:rPr>
-          <w:rFonts w:ascii="Times New Roman" w:hAnsi="Times New Roman" w:cs="Times New Roman"/>
-        </w:rPr>
-      </w:pPr>
-      <w:r>
-        <w:rPr>
-          <w:rFonts w:ascii="Times New Roman" w:hAnsi="Times New Roman" w:cs="Times New Roman"/>
-        </w:rPr>
-        <w:t>2. Why I Chose This Topic ...........................</w:t>
-      </w:r>
-      <w:r>
-        <w:rPr>
-          <w:rFonts w:ascii="Times New Roman" w:hAnsi="Times New Roman" w:cs="Times New Roman"/>
-        </w:rPr>
-        <w:t>........................................................</w:t>
-      </w:r>
-      <w:r>
-        <w:rPr>
-          <w:rFonts w:ascii="Times New Roman" w:hAnsi="Times New Roman" w:cs="Times New Roman"/>
-        </w:rPr>
-        <w:t>........................  5</w:t>
-      </w:r>
-    </w:p>
-    <w:p>
-      <w:pPr>
-        <w:spacing w:line="480" w:lineRule="auto"/>
-        <w:contextualSpacing/>
-        <w:rPr>
-          <w:rFonts w:ascii="Times New Roman" w:hAnsi="Times New Roman" w:cs="Times New Roman"/>
-        </w:rPr>
-      </w:pPr>
-      <w:r>
-        <w:rPr>
-          <w:rFonts w:ascii="Times New Roman" w:hAnsi="Times New Roman" w:cs="Times New Roman"/>
-        </w:rPr>
-        <w:t xml:space="preserve">   2.1 Personal and Practical Rationale ............</w:t>
-      </w:r>
-      <w:r>
-        <w:rPr>
-          <w:rFonts w:ascii="Times New Roman" w:hAnsi="Times New Roman" w:cs="Times New Roman"/>
-        </w:rPr>
-        <w:t>.....................................................</w:t>
-      </w:r>
-      <w:r>
-        <w:rPr>
-          <w:rFonts w:ascii="Times New Roman" w:hAnsi="Times New Roman" w:cs="Times New Roman"/>
-        </w:rPr>
-        <w:t>.........................  5</w:t>
-      </w:r>
-    </w:p>
-    <w:p>
-      <w:pPr>
-        <w:spacing w:line="480" w:lineRule="auto"/>
-        <w:contextualSpacing/>
-        <w:rPr>
-          <w:rFonts w:ascii="Times New Roman" w:hAnsi="Times New Roman" w:cs="Times New Roman"/>
-        </w:rPr>
-      </w:pPr>
-      <w:r>
-        <w:rPr>
-          <w:rFonts w:ascii="Times New Roman" w:hAnsi="Times New Roman" w:cs="Times New Roman"/>
-        </w:rPr>
-        <w:t xml:space="preserve">   2.2 Human Livelihoods and Mission-Critical Infrastructure ...........</w:t>
-      </w:r>
-      <w:r>
-        <w:rPr>
-          <w:rFonts w:ascii="Times New Roman" w:hAnsi="Times New Roman" w:cs="Times New Roman"/>
-        </w:rPr>
-        <w:t>......................................</w:t>
-      </w:r>
-      <w:r>
-        <w:rPr>
-          <w:rFonts w:ascii="Times New Roman" w:hAnsi="Times New Roman" w:cs="Times New Roman"/>
-        </w:rPr>
-        <w:t>....  5</w:t>
-      </w:r>
-    </w:p>
-    <w:p>
-      <w:pPr>
-        <w:spacing w:line="480" w:lineRule="auto"/>
-        <w:contextualSpacing/>
-        <w:rPr>
-          <w:rFonts w:ascii="Times New Roman" w:hAnsi="Times New Roman" w:cs="Times New Roman"/>
-        </w:rPr>
-      </w:pPr>
-    </w:p>
-    <w:p>
-      <w:pPr>
-        <w:spacing w:line="480" w:lineRule="auto"/>
-        <w:contextualSpacing/>
-        <w:rPr>
-          <w:rFonts w:ascii="Times New Roman" w:hAnsi="Times New Roman" w:cs="Times New Roman"/>
-        </w:rPr>
-      </w:pPr>
-      <w:r>
-        <w:rPr>
-          <w:rFonts w:ascii="Times New Roman" w:hAnsi="Times New Roman" w:cs="Times New Roman"/>
-        </w:rPr>
-        <w:t>3. Background .........................................................</w:t>
-      </w:r>
-      <w:r>
-        <w:rPr>
-          <w:rFonts w:ascii="Times New Roman" w:hAnsi="Times New Roman" w:cs="Times New Roman"/>
-        </w:rPr>
-        <w:t>................................................................</w:t>
-      </w:r>
-      <w:r>
-        <w:rPr>
-          <w:rFonts w:ascii="Times New Roman" w:hAnsi="Times New Roman" w:cs="Times New Roman"/>
-        </w:rPr>
-        <w:t>......  6</w:t>
-      </w:r>
-    </w:p>
-    <w:p>
-      <w:pPr>
-        <w:spacing w:line="480" w:lineRule="auto"/>
-        <w:contextualSpacing/>
-        <w:rPr>
-          <w:rFonts w:ascii="Times New Roman" w:hAnsi="Times New Roman" w:cs="Times New Roman"/>
-        </w:rPr>
-      </w:pPr>
-      <w:r>
-        <w:rPr>
-          <w:rFonts w:ascii="Times New Roman" w:hAnsi="Times New Roman" w:cs="Times New Roman"/>
-        </w:rPr>
-        <w:t xml:space="preserve">   3.1 Evolution of Core Systems (1970s–1990s) .......................</w:t>
-      </w:r>
-      <w:r>
-        <w:rPr>
-          <w:rFonts w:ascii="Times New Roman" w:hAnsi="Times New Roman" w:cs="Times New Roman"/>
-        </w:rPr>
-        <w:t>...........................................</w:t>
-      </w:r>
-      <w:r>
-        <w:rPr>
-          <w:rFonts w:ascii="Times New Roman" w:hAnsi="Times New Roman" w:cs="Times New Roman"/>
-        </w:rPr>
-        <w:t>........  6</w:t>
-      </w:r>
-    </w:p>
-    <w:p>
-      <w:pPr>
-        <w:spacing w:line="480" w:lineRule="auto"/>
-        <w:contextualSpacing/>
-        <w:rPr>
-          <w:rFonts w:ascii="Times New Roman" w:hAnsi="Times New Roman" w:cs="Times New Roman"/>
-        </w:rPr>
-      </w:pPr>
-      <w:r>
-        <w:rPr>
-          <w:rFonts w:ascii="Times New Roman" w:hAnsi="Times New Roman" w:cs="Times New Roman"/>
-        </w:rPr>
-        <w:t xml:space="preserve">   3.2 Demographic Shift: The Shrinking Legacy Workforce ..............</w:t>
-      </w:r>
-      <w:r>
-        <w:rPr>
-          <w:rFonts w:ascii="Times New Roman" w:hAnsi="Times New Roman" w:cs="Times New Roman"/>
-        </w:rPr>
-        <w:t>..................................</w:t>
-      </w:r>
-      <w:r>
-        <w:rPr>
-          <w:rFonts w:ascii="Times New Roman" w:hAnsi="Times New Roman" w:cs="Times New Roman"/>
-        </w:rPr>
-        <w:t>.......  6</w:t>
-      </w:r>
-    </w:p>
-    <w:p>
-      <w:pPr>
-        <w:spacing w:line="480" w:lineRule="auto"/>
-        <w:contextualSpacing/>
-        <w:rPr>
-          <w:rFonts w:ascii="Times New Roman" w:hAnsi="Times New Roman" w:cs="Times New Roman"/>
-        </w:rPr>
-      </w:pPr>
-      <w:r>
-        <w:rPr>
-          <w:rFonts w:ascii="Times New Roman" w:hAnsi="Times New Roman" w:cs="Times New Roman"/>
-        </w:rPr>
-        <w:t xml:space="preserve">   3.3 High-Stakes Sector Analysis: Banking, Healthcare, and Government ...</w:t>
-      </w:r>
-      <w:r>
-        <w:rPr>
-          <w:rFonts w:ascii="Times New Roman" w:hAnsi="Times New Roman" w:cs="Times New Roman"/>
-        </w:rPr>
-        <w:t>...........................</w:t>
-      </w:r>
-      <w:r>
-        <w:rPr>
-          <w:rFonts w:ascii="Times New Roman" w:hAnsi="Times New Roman" w:cs="Times New Roman"/>
-        </w:rPr>
-        <w:t>..  6</w:t>
-      </w:r>
-    </w:p>
-    <w:p>
-      <w:pPr>
-        <w:spacing w:line="480" w:lineRule="auto"/>
-        <w:contextualSpacing/>
-        <w:rPr>
-          <w:rFonts w:ascii="Times New Roman" w:hAnsi="Times New Roman" w:cs="Times New Roman"/>
-        </w:rPr>
-      </w:pPr>
-    </w:p>
-    <w:p>
-      <w:pPr>
-        <w:spacing w:line="480" w:lineRule="auto"/>
-        <w:contextualSpacing/>
-        <w:rPr>
-          <w:rFonts w:ascii="Times New Roman" w:hAnsi="Times New Roman" w:cs="Times New Roman"/>
-        </w:rPr>
-      </w:pPr>
-      <w:r>
-        <w:rPr>
-          <w:rFonts w:ascii="Times New Roman" w:hAnsi="Times New Roman" w:cs="Times New Roman"/>
-        </w:rPr>
-        <w:t>4. Data Analysis &amp; Architecture ......................................</w:t>
-      </w:r>
-      <w:r>
-        <w:rPr>
-          <w:rFonts w:ascii="Times New Roman" w:hAnsi="Times New Roman" w:cs="Times New Roman"/>
-        </w:rPr>
-        <w:t>......................................................</w:t>
-      </w:r>
-      <w:r>
-        <w:rPr>
-          <w:rFonts w:ascii="Times New Roman" w:hAnsi="Times New Roman" w:cs="Times New Roman"/>
-        </w:rPr>
-        <w:t>.......  7</w:t>
-      </w:r>
-    </w:p>
-    <w:p>
-      <w:pPr>
-        <w:spacing w:line="480" w:lineRule="auto"/>
-        <w:contextualSpacing/>
-        <w:rPr>
-          <w:rFonts w:ascii="Times New Roman" w:hAnsi="Times New Roman" w:cs="Times New Roman"/>
-        </w:rPr>
-      </w:pPr>
-      <w:r>
-        <w:rPr>
-          <w:rFonts w:ascii="Times New Roman" w:hAnsi="Times New Roman" w:cs="Times New Roman"/>
-        </w:rPr>
-        <w:t xml:space="preserve">   4.1 Evaluation of Modernization Frameworks ............</w:t>
-      </w:r>
-      <w:r>
-        <w:rPr>
-          <w:rFonts w:ascii="Times New Roman" w:hAnsi="Times New Roman" w:cs="Times New Roman"/>
-        </w:rPr>
-        <w:t>...........................................</w:t>
-      </w:r>
-      <w:r>
-        <w:rPr>
-          <w:rFonts w:ascii="Times New Roman" w:hAnsi="Times New Roman" w:cs="Times New Roman"/>
-        </w:rPr>
-        <w:t>...................  7</w:t>
-      </w:r>
-    </w:p>
-    <w:p>
-      <w:pPr>
-        <w:spacing w:line="480" w:lineRule="auto"/>
-        <w:contextualSpacing/>
-        <w:rPr>
-          <w:rFonts w:ascii="Times New Roman" w:hAnsi="Times New Roman" w:cs="Times New Roman"/>
-        </w:rPr>
-      </w:pPr>
-      <w:r>
-        <w:rPr>
-          <w:rFonts w:ascii="Times New Roman" w:hAnsi="Times New Roman" w:cs="Times New Roman"/>
-        </w:rPr>
-        <w:t xml:space="preserve">   4.2 Architecture Trade-off Matrix (Figure 1) .....................</w:t>
-      </w:r>
-      <w:r>
-        <w:rPr>
-          <w:rFonts w:ascii="Times New Roman" w:hAnsi="Times New Roman" w:cs="Times New Roman"/>
-        </w:rPr>
-        <w:t>................................................</w:t>
-      </w:r>
-      <w:r>
-        <w:rPr>
-          <w:rFonts w:ascii="Times New Roman" w:hAnsi="Times New Roman" w:cs="Times New Roman"/>
-        </w:rPr>
-        <w:t>........  7</w:t>
-      </w:r>
-    </w:p>
-    <w:p>
-      <w:pPr>
-        <w:spacing w:line="480" w:lineRule="auto"/>
-        <w:contextualSpacing/>
-        <w:rPr>
-          <w:rFonts w:ascii="Times New Roman" w:hAnsi="Times New Roman" w:cs="Times New Roman"/>
-        </w:rPr>
-      </w:pPr>
-      <w:r>
-        <w:rPr>
-          <w:rFonts w:ascii="Times New Roman" w:hAnsi="Times New Roman" w:cs="Times New Roman"/>
-        </w:rPr>
-        <w:t xml:space="preserve">   4.3 Risk-Reward Profiling of Migration Patterns ...............</w:t>
-      </w:r>
-      <w:r>
-        <w:rPr>
-          <w:rFonts w:ascii="Times New Roman" w:hAnsi="Times New Roman" w:cs="Times New Roman"/>
-        </w:rPr>
-        <w:t>...........................................</w:t>
-      </w:r>
-      <w:r>
-        <w:rPr>
-          <w:rFonts w:ascii="Times New Roman" w:hAnsi="Times New Roman" w:cs="Times New Roman"/>
-        </w:rPr>
-        <w:t>............  8</w:t>
-      </w:r>
-    </w:p>
-    <w:p>
-      <w:pPr>
-        <w:spacing w:line="480" w:lineRule="auto"/>
-        <w:contextualSpacing/>
-        <w:rPr>
-          <w:rFonts w:ascii="Times New Roman" w:hAnsi="Times New Roman" w:cs="Times New Roman"/>
-        </w:rPr>
-      </w:pPr>
-    </w:p>
-    <w:p>
-      <w:pPr>
-        <w:spacing w:line="480" w:lineRule="auto"/>
-        <w:contextualSpacing/>
-        <w:rPr>
-          <w:rFonts w:ascii="Times New Roman" w:hAnsi="Times New Roman" w:cs="Times New Roman"/>
-        </w:rPr>
-      </w:pPr>
-      <w:r>
-        <w:rPr>
-          <w:rFonts w:ascii="Times New Roman" w:hAnsi="Times New Roman" w:cs="Times New Roman"/>
-        </w:rPr>
-        <w:lastRenderedPageBreak/>
-        <w:t>5. Findings ...................</w:t>
-      </w:r>
-      <w:r>
-        <w:rPr>
-          <w:rFonts w:ascii="Times New Roman" w:hAnsi="Times New Roman" w:cs="Times New Roman"/>
-        </w:rPr>
-        <w:t>....................................................................................................</w:t>
-      </w:r>
-      <w:r>
-        <w:rPr>
-          <w:rFonts w:ascii="Times New Roman" w:hAnsi="Times New Roman" w:cs="Times New Roman"/>
-        </w:rPr>
-        <w:t>.............. 8</w:t>
-      </w:r>
-    </w:p>
-    <w:p>
-      <w:pPr>
-        <w:spacing w:line="480" w:lineRule="auto"/>
-        <w:contextualSpacing/>
-        <w:rPr>
-          <w:rFonts w:ascii="Times New Roman" w:hAnsi="Times New Roman" w:cs="Times New Roman"/>
-        </w:rPr>
-      </w:pPr>
-      <w:r>
-        <w:rPr>
-          <w:rFonts w:ascii="Times New Roman" w:hAnsi="Times New Roman" w:cs="Times New Roman"/>
-        </w:rPr>
-        <w:t xml:space="preserve">   5.1 Incremental Refactoring via the Strangler Fig Pattern .......</w:t>
-      </w:r>
-      <w:r>
-        <w:rPr>
-          <w:rFonts w:ascii="Times New Roman" w:hAnsi="Times New Roman" w:cs="Times New Roman"/>
-        </w:rPr>
-        <w:t>.......................................</w:t>
-      </w:r>
-      <w:r>
-        <w:rPr>
-          <w:rFonts w:ascii="Times New Roman" w:hAnsi="Times New Roman" w:cs="Times New Roman"/>
-        </w:rPr>
-        <w:t>..........  8</w:t>
-      </w:r>
-    </w:p>
-    <w:p>
-      <w:pPr>
-        <w:spacing w:line="480" w:lineRule="auto"/>
-        <w:contextualSpacing/>
-        <w:rPr>
-          <w:rFonts w:ascii="Times New Roman" w:hAnsi="Times New Roman" w:cs="Times New Roman"/>
-        </w:rPr>
-      </w:pPr>
-      <w:r>
-        <w:rPr>
-          <w:rFonts w:ascii="Times New Roman" w:hAnsi="Times New Roman" w:cs="Times New Roman"/>
-        </w:rPr>
-        <w:t xml:space="preserve">   5.2 API Facades, Microservices, and Zero-Downtime Migration .........</w:t>
-      </w:r>
-      <w:r>
-        <w:rPr>
-          <w:rFonts w:ascii="Times New Roman" w:hAnsi="Times New Roman" w:cs="Times New Roman"/>
-        </w:rPr>
-        <w:t>...............................</w:t>
-      </w:r>
-      <w:r>
-        <w:rPr>
-          <w:rFonts w:ascii="Times New Roman" w:hAnsi="Times New Roman" w:cs="Times New Roman"/>
-        </w:rPr>
-        <w:t>.....  8</w:t>
-      </w:r>
-    </w:p>
-    <w:p>
-      <w:pPr>
-        <w:spacing w:line="480" w:lineRule="auto"/>
-        <w:contextualSpacing/>
-        <w:rPr>
-          <w:rFonts w:ascii="Times New Roman" w:hAnsi="Times New Roman" w:cs="Times New Roman"/>
-        </w:rPr>
-      </w:pPr>
-      <w:r>
-        <w:rPr>
-          <w:rFonts w:ascii="Times New Roman" w:hAnsi="Times New Roman" w:cs="Times New Roman"/>
-        </w:rPr>
-        <w:t xml:space="preserve">   5.3 Knowledge Transfer and Cross-Skilling Workforce Strategies ......</w:t>
-      </w:r>
-      <w:r>
-        <w:rPr>
-          <w:rFonts w:ascii="Times New Roman" w:hAnsi="Times New Roman" w:cs="Times New Roman"/>
-        </w:rPr>
-        <w:t>...............................</w:t>
-      </w:r>
-      <w:r>
-        <w:rPr>
-          <w:rFonts w:ascii="Times New Roman" w:hAnsi="Times New Roman" w:cs="Times New Roman"/>
-        </w:rPr>
-        <w:t>......  9</w:t>
-      </w:r>
-    </w:p>
-    <w:p>
-      <w:pPr>
-        <w:spacing w:line="480" w:lineRule="auto"/>
-        <w:contextualSpacing/>
-        <w:rPr>
-          <w:rFonts w:ascii="Times New Roman" w:hAnsi="Times New Roman" w:cs="Times New Roman"/>
-        </w:rPr>
-      </w:pPr>
-    </w:p>
-    <w:p>
-      <w:pPr>
-        <w:spacing w:line="480" w:lineRule="auto"/>
-        <w:contextualSpacing/>
-        <w:rPr>
-          <w:rFonts w:ascii="Times New Roman" w:hAnsi="Times New Roman" w:cs="Times New Roman"/>
-        </w:rPr>
-      </w:pPr>
-      <w:r>
-        <w:rPr>
-          <w:rFonts w:ascii="Times New Roman" w:hAnsi="Times New Roman" w:cs="Times New Roman"/>
-        </w:rPr>
-        <w:t>6. Conclusions ........................................</w:t>
-      </w:r>
-      <w:r>
-        <w:rPr>
-          <w:rFonts w:ascii="Times New Roman" w:hAnsi="Times New Roman" w:cs="Times New Roman"/>
-        </w:rPr>
-        <w:t>.................................................................</w:t>
-      </w:r>
-      <w:r>
-        <w:rPr>
-          <w:rFonts w:ascii="Times New Roman" w:hAnsi="Times New Roman" w:cs="Times New Roman"/>
-        </w:rPr>
-        <w:t>......................  9</w:t>
-      </w:r>
-    </w:p>
-    <w:p>
-      <w:pPr>
-        <w:spacing w:line="480" w:lineRule="auto"/>
-        <w:contextualSpacing/>
-        <w:rPr>
-          <w:rFonts w:ascii="Times New Roman" w:hAnsi="Times New Roman" w:cs="Times New Roman"/>
-        </w:rPr>
-      </w:pPr>
-      <w:r>
-        <w:rPr>
-          <w:rFonts w:ascii="Times New Roman" w:hAnsi="Times New Roman" w:cs="Times New Roman"/>
-        </w:rPr>
-        <w:t>7. Recommendations ...................................</w:t>
-      </w:r>
-      <w:r>
-        <w:rPr>
-          <w:rFonts w:ascii="Times New Roman" w:hAnsi="Times New Roman" w:cs="Times New Roman"/>
-        </w:rPr>
-        <w:t>...........................................................</w:t>
-      </w:r>
-      <w:r>
-        <w:rPr>
-          <w:rFonts w:ascii="Times New Roman" w:hAnsi="Times New Roman" w:cs="Times New Roman"/>
-        </w:rPr>
-        <w:t>.......................  9</w:t>
-      </w:r>
-    </w:p>
-    <w:p>
-      <w:pPr>
-        <w:spacing w:line="480" w:lineRule="auto"/>
-        <w:contextualSpacing/>
-        <w:rPr>
-          <w:rFonts w:ascii="Times New Roman" w:hAnsi="Times New Roman" w:cs="Times New Roman"/>
-        </w:rPr>
-      </w:pPr>
-      <w:r>
-        <w:rPr>
-          <w:rFonts w:ascii="Times New Roman" w:hAnsi="Times New Roman" w:cs="Times New Roman"/>
-        </w:rPr>
-        <w:t>References .........................................</w:t>
-      </w:r>
-      <w:r>
-        <w:rPr>
-          <w:rFonts w:ascii="Times New Roman" w:hAnsi="Times New Roman" w:cs="Times New Roman"/>
-        </w:rPr>
-        <w:t>..................................................................</w:t>
-      </w:r>
-      <w:r>
-        <w:rPr>
-          <w:rFonts w:ascii="Times New Roman" w:hAnsi="Times New Roman" w:cs="Times New Roman"/>
-        </w:rPr>
-        <w:t>......................... 10</w:t>
-      </w:r>
+        <w:t>Executive Summary ......................................................................................................................  3</w:t>
+      </w:r>
+    </w:p>
+    <w:p>
+      <w:pPr>
+        <w:spacing w:line="480" w:lineRule="auto"/>
+        <w:contextualSpacing/>
+        <w:rPr>
+          <w:rFonts w:ascii="Times New Roman" w:hAnsi="Times New Roman" w:cs="Times New Roman"/>
+        </w:rPr>
+      </w:pPr>
+    </w:p>
+    <w:p>
+      <w:pPr>
+        <w:spacing w:line="480" w:lineRule="auto"/>
+        <w:contextualSpacing/>
+        <w:rPr>
+          <w:rFonts w:ascii="Times New Roman" w:hAnsi="Times New Roman" w:cs="Times New Roman"/>
+        </w:rPr>
+      </w:pPr>
+    </w:p>
+    <w:p>
+      <w:pPr>
+        <w:spacing w:line="480" w:lineRule="auto"/>
+        <w:contextualSpacing/>
+        <w:rPr>
+          <w:rFonts w:ascii="Times New Roman" w:hAnsi="Times New Roman" w:cs="Times New Roman"/>
+        </w:rPr>
+      </w:pPr>
+    </w:p>
+    <w:p>
+      <w:pPr>
+        <w:spacing w:line="480" w:lineRule="auto"/>
+        <w:contextualSpacing/>
+        <w:rPr>
+          <w:rFonts w:ascii="Times New Roman" w:hAnsi="Times New Roman" w:cs="Times New Roman"/>
+        </w:rPr>
+      </w:pPr>
+    </w:p>
+    <w:p>
+      <w:pPr>
+        <w:spacing w:line="480" w:lineRule="auto"/>
+        <w:contextualSpacing/>
+        <w:rPr>
+          <w:rFonts w:ascii="Times New Roman" w:hAnsi="Times New Roman" w:cs="Times New Roman"/>
+        </w:rPr>
+      </w:pPr>
     </w:p>
     <w:p>
       <w:pPr>
@@ -1108,72 +480,445 @@
         <w:spacing w:line="480" w:lineRule="auto"/>
         <w:contextualSpacing/>
         <w:jc w:val="center"/>
-      </w:pPr>
-      <w:r>
+        <w:rPr>
+          <w:rFonts w:ascii="Times New Roman" w:hAnsi="Times New Roman" w:cs="Times New Roman"/>
+        </w:rPr>
+      </w:pPr>
+      <w:r>
+        <w:rPr>
+          <w:rFonts w:ascii="Times New Roman" w:hAnsi="Times New Roman" w:cs="Times New Roman"/>
+        </w:rPr>
         <w:lastRenderedPageBreak/>
         <w:t>EXECUTIVE SUMMARY</w:t>
       </w:r>
     </w:p>
     <w:p>
       <w:pPr>
-        <w:spacing w:line="480" w:lineRule="auto"/>
-        <w:contextualSpacing/>
-      </w:pPr>
-      <w:r>
-        <w:t>Purpose of Research</w:t>
-      </w:r>
-      <w:r>
-        <w:t>:</w:t>
-      </w:r>
-      <w:r>
-        <w:t xml:space="preserve"> Enterprise software maintenance has become a critical strategic discipline for organizations operating legacy infrastructure established between the 1970s and 1990s. The primary purpose of this research report is to examine effective methodologies for managing accumulated technical debt in core monolithic applications. Specifically, this study evaluates strategies for refactoring legacy codebase architectures without causing operational downtime, while simultaneously addressing the severe risk posed by a dwindling population of legacy language developers (e.g., COBOL, Fortran, Ada). Problem Statement</w:t>
-      </w:r>
-      <w:r>
-        <w:t>:</w:t>
-      </w:r>
-      <w:r>
-        <w:t xml:space="preserve"> Decades of continuous feature additions, architectural decay, and informal modification</w:t>
-      </w:r>
-      <w:r>
-        <w:t>s</w:t>
-      </w:r>
-      <w:r>
-        <w:t xml:space="preserve"> have turned mission-critical enterprise monoliths into brittle systems </w:t>
-      </w:r>
-      <w:r>
-        <w:t>with</w:t>
-      </w:r>
-      <w:r>
-        <w:t xml:space="preserve"> high maintenance costs and extreme operational fragility. As original domain experts retire, organizations face an escalating talent gap. </w:t>
-      </w:r>
-      <w:r>
-        <w:t>W</w:t>
-      </w:r>
-      <w:r>
-        <w:t xml:space="preserve">holesale "big-bang" system replacements </w:t>
-      </w:r>
-      <w:r>
-        <w:t>often</w:t>
-      </w:r>
-      <w:r>
+        <w:shd w:val="clear" w:color="auto" w:fill="FFFFFF"/>
+        <w:spacing w:before="90" w:after="0" w:line="480" w:lineRule="auto"/>
+        <w:ind w:firstLine="504"/>
+        <w:jc w:val="both"/>
+        <w:rPr>
+          <w:rFonts w:ascii="Times New Roman" w:eastAsia="Times New Roman" w:hAnsi="Times New Roman" w:cs="Times New Roman"/>
+          <w:color w:val="111111"/>
+          <w:kern w:val="0"/>
+          <w14:ligatures w14:val="none"/>
+        </w:rPr>
+      </w:pPr>
+      <w:r>
+        <w:rPr>
+          <w:rFonts w:ascii="Times New Roman" w:eastAsia="Times New Roman" w:hAnsi="Times New Roman" w:cs="Times New Roman"/>
+          <w:color w:val="111111"/>
+          <w:kern w:val="0"/>
+          <w14:ligatures w14:val="none"/>
+        </w:rPr>
+        <w:t>Technology that runs crucial industries</w:t>
+      </w:r>
+      <w:r>
+        <w:rPr>
+          <w:rFonts w:ascii="Times New Roman" w:eastAsia="Times New Roman" w:hAnsi="Times New Roman" w:cs="Times New Roman"/>
+          <w:color w:val="111111"/>
+          <w:kern w:val="0"/>
+          <w14:ligatures w14:val="none"/>
+        </w:rPr>
+        <w:t>—such as core banking transaction platforms, electronic healthcare databases, and public government administration networks—relies heavily on monolithic software architectures built between the 1970s and 1990s. While these systems have provided foundational reliability for decades, accumulated technical debt and a rapidly shrinking pool of legacy developers present severe operational risk.</w:t>
+      </w:r>
+      <w:r>
+        <w:rPr>
+          <w:rFonts w:ascii="Times New Roman" w:eastAsia="Times New Roman" w:hAnsi="Times New Roman" w:cs="Times New Roman"/>
+          <w:color w:val="111111"/>
+          <w:kern w:val="0"/>
+          <w14:ligatures w14:val="none"/>
+        </w:rPr>
+        <w:t xml:space="preserve"> As these programs age, bugs are discovered that become increasingly difficult and time-consuming to fix.</w:t>
+      </w:r>
+      <w:r>
+        <w:rPr>
+          <w:rFonts w:ascii="Times New Roman" w:eastAsia="Times New Roman" w:hAnsi="Times New Roman" w:cs="Times New Roman"/>
+          <w:color w:val="111111"/>
+          <w:kern w:val="0"/>
+          <w14:ligatures w14:val="none"/>
+        </w:rPr>
         <w:t xml:space="preserve"> </w:t>
       </w:r>
       <w:r>
-        <w:t>lead</w:t>
-      </w:r>
-      <w:r>
+        <w:rPr>
+          <w:rFonts w:ascii="Times New Roman" w:eastAsia="Times New Roman" w:hAnsi="Times New Roman" w:cs="Times New Roman"/>
+          <w:color w:val="111111"/>
+          <w:kern w:val="0"/>
+          <w14:ligatures w14:val="none"/>
+        </w:rPr>
+        <w:t xml:space="preserve">As the workforce for these programs shrinks, these bugs </w:t>
+      </w:r>
+      <w:r>
+        <w:rPr>
+          <w:rFonts w:ascii="Times New Roman" w:eastAsia="Times New Roman" w:hAnsi="Times New Roman" w:cs="Times New Roman"/>
+          <w:color w:val="111111"/>
+          <w:kern w:val="0"/>
+          <w14:ligatures w14:val="none"/>
+        </w:rPr>
+        <w:t xml:space="preserve">require more time and effort to fix to keep the program functional. </w:t>
+      </w:r>
+      <w:r>
+        <w:rPr>
+          <w:rFonts w:ascii="Times New Roman" w:eastAsia="Times New Roman" w:hAnsi="Times New Roman" w:cs="Times New Roman"/>
+          <w:color w:val="111111"/>
+          <w:kern w:val="0"/>
+          <w14:ligatures w14:val="none"/>
+        </w:rPr>
+        <w:t>O</w:t>
+      </w:r>
+      <w:r>
+        <w:rPr>
+          <w:rFonts w:ascii="Times New Roman" w:eastAsia="Times New Roman" w:hAnsi="Times New Roman" w:cs="Times New Roman"/>
+          <w:color w:val="111111"/>
+          <w:kern w:val="0"/>
+          <w14:ligatures w14:val="none"/>
+        </w:rPr>
+        <w:t xml:space="preserve">rganizations face a </w:t>
+      </w:r>
+      <w:r>
+        <w:rPr>
+          <w:rFonts w:ascii="Times New Roman" w:eastAsia="Times New Roman" w:hAnsi="Times New Roman" w:cs="Times New Roman"/>
+          <w:color w:val="111111"/>
+          <w:kern w:val="0"/>
+          <w14:ligatures w14:val="none"/>
+        </w:rPr>
+        <w:t>requirement</w:t>
+      </w:r>
+      <w:r>
+        <w:rPr>
+          <w:rFonts w:ascii="Times New Roman" w:eastAsia="Times New Roman" w:hAnsi="Times New Roman" w:cs="Times New Roman"/>
+          <w:color w:val="111111"/>
+          <w:kern w:val="0"/>
+          <w14:ligatures w14:val="none"/>
+        </w:rPr>
+        <w:t xml:space="preserve"> to refactor and modernize these monolithic systems without causing service disruption. </w:t>
+      </w:r>
+      <w:r>
+        <w:rPr>
+          <w:rFonts w:ascii="Times New Roman" w:eastAsia="Times New Roman" w:hAnsi="Times New Roman" w:cs="Times New Roman"/>
+          <w:color w:val="111111"/>
+          <w:kern w:val="0"/>
+          <w14:ligatures w14:val="none"/>
+        </w:rPr>
+        <w:t>However, a</w:t>
+      </w:r>
+      <w:r>
+        <w:rPr>
+          <w:rFonts w:ascii="Times New Roman" w:eastAsia="Times New Roman" w:hAnsi="Times New Roman" w:cs="Times New Roman"/>
+          <w:color w:val="111111"/>
+          <w:kern w:val="0"/>
+          <w14:ligatures w14:val="none"/>
+        </w:rPr>
+        <w:t xml:space="preserve"> complete "rip-and-replace" </w:t>
+      </w:r>
+      <w:r>
+        <w:rPr>
+          <w:rFonts w:ascii="Times New Roman" w:eastAsia="Times New Roman" w:hAnsi="Times New Roman" w:cs="Times New Roman"/>
+          <w:color w:val="111111"/>
+          <w:kern w:val="0"/>
+          <w14:ligatures w14:val="none"/>
+        </w:rPr>
+        <w:t>reconstruction</w:t>
+      </w:r>
+      <w:r>
+        <w:rPr>
+          <w:rFonts w:ascii="Times New Roman" w:eastAsia="Times New Roman" w:hAnsi="Times New Roman" w:cs="Times New Roman"/>
+          <w:color w:val="111111"/>
+          <w:kern w:val="0"/>
+          <w14:ligatures w14:val="none"/>
+        </w:rPr>
+        <w:t xml:space="preserve"> would </w:t>
+      </w:r>
+      <w:r>
+        <w:rPr>
+          <w:rFonts w:ascii="Times New Roman" w:eastAsia="Times New Roman" w:hAnsi="Times New Roman" w:cs="Times New Roman"/>
+          <w:color w:val="111111"/>
+          <w:kern w:val="0"/>
+          <w14:ligatures w14:val="none"/>
+        </w:rPr>
+        <w:t>result in</w:t>
+      </w:r>
+      <w:r>
+        <w:rPr>
+          <w:rFonts w:ascii="Times New Roman" w:eastAsia="Times New Roman" w:hAnsi="Times New Roman" w:cs="Times New Roman"/>
+          <w:color w:val="111111"/>
+          <w:kern w:val="0"/>
+          <w14:ligatures w14:val="none"/>
+        </w:rPr>
+        <w:t xml:space="preserve"> unacceptable downtime and is too risky</w:t>
+      </w:r>
+      <w:r>
+        <w:rPr>
+          <w:rFonts w:ascii="Times New Roman" w:eastAsia="Times New Roman" w:hAnsi="Times New Roman" w:cs="Times New Roman"/>
+          <w:color w:val="111111"/>
+          <w:kern w:val="0"/>
+          <w14:ligatures w14:val="none"/>
+        </w:rPr>
+        <w:t xml:space="preserve"> to be viable</w:t>
+      </w:r>
+      <w:r>
+        <w:rPr>
+          <w:rFonts w:ascii="Times New Roman" w:eastAsia="Times New Roman" w:hAnsi="Times New Roman" w:cs="Times New Roman"/>
+          <w:color w:val="111111"/>
+          <w:kern w:val="0"/>
+          <w14:ligatures w14:val="none"/>
+        </w:rPr>
+        <w:t xml:space="preserve">. Instead, organizations must implement incremental migration architectures, specifically the Strangler Fig pattern, </w:t>
+      </w:r>
+      <w:r>
+        <w:rPr>
+          <w:rFonts w:ascii="Times New Roman" w:eastAsia="Times New Roman" w:hAnsi="Times New Roman" w:cs="Times New Roman"/>
+          <w:color w:val="111111"/>
+          <w:kern w:val="0"/>
+          <w14:ligatures w14:val="none"/>
+        </w:rPr>
+        <w:t xml:space="preserve">along </w:t>
+      </w:r>
+      <w:r>
+        <w:rPr>
+          <w:rFonts w:ascii="Times New Roman" w:eastAsia="Times New Roman" w:hAnsi="Times New Roman" w:cs="Times New Roman"/>
+          <w:color w:val="111111"/>
+          <w:kern w:val="0"/>
+          <w14:ligatures w14:val="none"/>
+        </w:rPr>
+        <w:t>with structured</w:t>
+      </w:r>
+      <w:r>
+        <w:rPr>
+          <w:rFonts w:ascii="Times New Roman" w:eastAsia="Times New Roman" w:hAnsi="Times New Roman" w:cs="Times New Roman"/>
+          <w:color w:val="111111"/>
+          <w:kern w:val="0"/>
+          <w14:ligatures w14:val="none"/>
+        </w:rPr>
+        <w:t xml:space="preserve"> knowledge transfer </w:t>
+      </w:r>
+      <w:r>
+        <w:rPr>
+          <w:rFonts w:ascii="Times New Roman" w:eastAsia="Times New Roman" w:hAnsi="Times New Roman" w:cs="Times New Roman"/>
+          <w:color w:val="111111"/>
+          <w:kern w:val="0"/>
+          <w14:ligatures w14:val="none"/>
+        </w:rPr>
+        <w:t>and modern staffing</w:t>
+      </w:r>
+      <w:r>
+        <w:rPr>
+          <w:rFonts w:ascii="Times New Roman" w:eastAsia="Times New Roman" w:hAnsi="Times New Roman" w:cs="Times New Roman"/>
+          <w:color w:val="111111"/>
+          <w:kern w:val="0"/>
+          <w14:ligatures w14:val="none"/>
+        </w:rPr>
+        <w:t xml:space="preserve"> to ensure long-term </w:t>
+      </w:r>
+      <w:r>
+        <w:rPr>
+          <w:rFonts w:ascii="Times New Roman" w:eastAsia="Times New Roman" w:hAnsi="Times New Roman" w:cs="Times New Roman"/>
+          <w:color w:val="111111"/>
+          <w:kern w:val="0"/>
+          <w14:ligatures w14:val="none"/>
+        </w:rPr>
+        <w:t>resilience of the system</w:t>
+      </w:r>
+      <w:r>
+        <w:rPr>
+          <w:rFonts w:ascii="Times New Roman" w:eastAsia="Times New Roman" w:hAnsi="Times New Roman" w:cs="Times New Roman"/>
+          <w:color w:val="111111"/>
+          <w:kern w:val="0"/>
+          <w14:ligatures w14:val="none"/>
+        </w:rPr>
+        <w:t>.</w:t>
+      </w:r>
+    </w:p>
+    <w:p>
+      <w:pPr>
+        <w:shd w:val="clear" w:color="auto" w:fill="FFFFFF"/>
+        <w:spacing w:before="150" w:after="30" w:line="480" w:lineRule="auto"/>
+        <w:outlineLvl w:val="2"/>
+        <w:rPr>
+          <w:rFonts w:ascii="Times New Roman" w:eastAsia="Times New Roman" w:hAnsi="Times New Roman" w:cs="Times New Roman"/>
+          <w:b/>
+          <w:bCs/>
+          <w:color w:val="222222"/>
+          <w:kern w:val="0"/>
+          <w14:ligatures w14:val="none"/>
+        </w:rPr>
+      </w:pPr>
+      <w:r>
+        <w:rPr>
+          <w:rFonts w:ascii="Times New Roman" w:eastAsia="Times New Roman" w:hAnsi="Times New Roman" w:cs="Times New Roman"/>
+          <w:b/>
+          <w:bCs/>
+          <w:color w:val="222222"/>
+          <w:kern w:val="0"/>
+          <w14:ligatures w14:val="none"/>
+        </w:rPr>
+        <w:t>Problem Statement &amp; Scope</w:t>
+      </w:r>
+    </w:p>
+    <w:p>
+      <w:pPr>
+        <w:shd w:val="clear" w:color="auto" w:fill="FFFFFF"/>
+        <w:spacing w:before="90" w:after="0" w:line="480" w:lineRule="auto"/>
+        <w:ind w:firstLine="504"/>
+        <w:jc w:val="both"/>
+        <w:rPr>
+          <w:rFonts w:ascii="Times New Roman" w:eastAsia="Times New Roman" w:hAnsi="Times New Roman" w:cs="Times New Roman"/>
+          <w:color w:val="111111"/>
+          <w:kern w:val="0"/>
+          <w14:ligatures w14:val="none"/>
+        </w:rPr>
+      </w:pPr>
+      <w:r>
+        <w:rPr>
+          <w:rFonts w:ascii="Times New Roman" w:eastAsia="Times New Roman" w:hAnsi="Times New Roman" w:cs="Times New Roman"/>
+          <w:color w:val="111111"/>
+          <w:kern w:val="0"/>
+          <w14:ligatures w14:val="none"/>
+        </w:rPr>
+        <w:t>Decades of patch-based maintenance have created fragile, highly coupled legacy codebases</w:t>
+      </w:r>
+      <w:r>
+        <w:rPr>
+          <w:rFonts w:ascii="Times New Roman" w:eastAsia="Times New Roman" w:hAnsi="Times New Roman" w:cs="Times New Roman"/>
+          <w:color w:val="111111"/>
+          <w:kern w:val="0"/>
+          <w14:ligatures w14:val="none"/>
+        </w:rPr>
+        <w:t>, which means modifying code could break unrelated code in other areas.</w:t>
+      </w:r>
+      <w:r>
+        <w:rPr>
+          <w:rFonts w:ascii="Times New Roman" w:eastAsia="Times New Roman" w:hAnsi="Times New Roman" w:cs="Times New Roman"/>
+          <w:color w:val="111111"/>
+          <w:kern w:val="0"/>
+          <w14:ligatures w14:val="none"/>
+        </w:rPr>
         <w:t xml:space="preserve"> </w:t>
       </w:r>
       <w:r>
-        <w:t>to</w:t>
-      </w:r>
-      <w:r>
-        <w:t xml:space="preserve"> catastrophic project failures, multi-million-dollar budget overruns, and severe service disruptions across essential societal sectors, including global banking networks, healthcare delivery platforms, and critical government operations. Key Findings &amp; Strategic Roadmap 1. Incremental Modernization: Monolithic refactoring using the Strangler Fig architectural pattern, supported by API facades, enables risk-controlled component replacement with zero operational downtime. 2. Workforce Integration: Mitigating the legacy developer talent shortage requires paired cross-skilling programs, automated code analysis, and AI-assisted documentation rather than immediate language replacement. 3. Sector-Specific Resilience: Mission-critical environments in banking, </w:t>
-      </w:r>
-      <w:r>
-        <w:lastRenderedPageBreak/>
-        <w:t>healthcare, and public governance benefit most from iterative API wrapping and microservices decomposition rather than complete legacy system rewriting.</w:t>
-      </w:r>
+        <w:rPr>
+          <w:rFonts w:ascii="Times New Roman" w:hAnsi="Times New Roman" w:cs="Times New Roman"/>
+        </w:rPr>
+        <w:t xml:space="preserve">At its core, the problem </w:t>
+      </w:r>
+      <w:r>
+        <w:rPr>
+          <w:rFonts w:ascii="Times New Roman" w:hAnsi="Times New Roman" w:cs="Times New Roman"/>
+        </w:rPr>
+        <w:t>stems from</w:t>
+      </w:r>
+      <w:r>
+        <w:rPr>
+          <w:rFonts w:ascii="Times New Roman" w:hAnsi="Times New Roman" w:cs="Times New Roman"/>
+        </w:rPr>
+        <w:t xml:space="preserve"> two main issues: outdated technology that is difficult to modernize, and a serious lack of specialized talent</w:t>
+      </w:r>
+      <w:r>
+        <w:rPr>
+          <w:rFonts w:ascii="Times New Roman" w:hAnsi="Times New Roman" w:cs="Times New Roman"/>
+        </w:rPr>
+        <w:t xml:space="preserve"> to work on </w:t>
+      </w:r>
+      <w:r>
+        <w:rPr>
+          <w:rFonts w:ascii="Times New Roman" w:hAnsi="Times New Roman" w:cs="Times New Roman"/>
+        </w:rPr>
+        <w:t>these programs</w:t>
+      </w:r>
+      <w:r>
+        <w:rPr>
+          <w:rFonts w:ascii="Times New Roman" w:hAnsi="Times New Roman" w:cs="Times New Roman"/>
+        </w:rPr>
+        <w:t>.</w:t>
+      </w:r>
+      <w:r>
+        <w:rPr>
+          <w:rFonts w:ascii="Times New Roman" w:hAnsi="Times New Roman" w:cs="Times New Roman"/>
+        </w:rPr>
+        <w:t xml:space="preserve"> </w:t>
+      </w:r>
+      <w:r>
+        <w:rPr>
+          <w:rFonts w:ascii="Times New Roman" w:eastAsia="Times New Roman" w:hAnsi="Times New Roman" w:cs="Times New Roman"/>
+          <w:color w:val="111111"/>
+          <w:kern w:val="0"/>
+          <w14:ligatures w14:val="none"/>
+        </w:rPr>
+        <w:t xml:space="preserve">The engineers who originally designed these platforms are entering retirement, leaving organizations with insufficient staff who understand core domain logic (Emergent Staffing, 2026; </w:t>
+      </w:r>
+      <w:proofErr w:type="spellStart"/>
+      <w:r>
+        <w:rPr>
+          <w:rFonts w:ascii="Times New Roman" w:eastAsia="Times New Roman" w:hAnsi="Times New Roman" w:cs="Times New Roman"/>
+          <w:color w:val="111111"/>
+          <w:kern w:val="0"/>
+          <w14:ligatures w14:val="none"/>
+        </w:rPr>
+        <w:t>SoftSages</w:t>
+      </w:r>
+      <w:proofErr w:type="spellEnd"/>
+      <w:r>
+        <w:rPr>
+          <w:rFonts w:ascii="Times New Roman" w:eastAsia="Times New Roman" w:hAnsi="Times New Roman" w:cs="Times New Roman"/>
+          <w:color w:val="111111"/>
+          <w:kern w:val="0"/>
+          <w14:ligatures w14:val="none"/>
+        </w:rPr>
+        <w:t xml:space="preserve">, 2026). In </w:t>
+      </w:r>
+      <w:r>
+        <w:rPr>
+          <w:rFonts w:ascii="Times New Roman" w:eastAsia="Times New Roman" w:hAnsi="Times New Roman" w:cs="Times New Roman"/>
+          <w:color w:val="111111"/>
+          <w:kern w:val="0"/>
+          <w14:ligatures w14:val="none"/>
+        </w:rPr>
+        <w:t>core</w:t>
+      </w:r>
+      <w:r>
+        <w:rPr>
+          <w:rFonts w:ascii="Times New Roman" w:eastAsia="Times New Roman" w:hAnsi="Times New Roman" w:cs="Times New Roman"/>
+          <w:color w:val="111111"/>
+          <w:kern w:val="0"/>
+          <w14:ligatures w14:val="none"/>
+        </w:rPr>
+        <w:t xml:space="preserve"> environments—including banking systems processing daily transactions, electronic health record systems supporting patient safety, and government compliance platforms—any unplanned outage carries severe financial, legal, and operational consequences.</w:t>
+      </w:r>
+      <w:r>
+        <w:rPr>
+          <w:rFonts w:ascii="Times New Roman" w:eastAsia="Times New Roman" w:hAnsi="Times New Roman" w:cs="Times New Roman"/>
+          <w:color w:val="111111"/>
+          <w:kern w:val="0"/>
+          <w14:ligatures w14:val="none"/>
+        </w:rPr>
+        <w:t xml:space="preserve"> </w:t>
+      </w:r>
+    </w:p>
+    <w:p>
+      <w:pPr>
+        <w:shd w:val="clear" w:color="auto" w:fill="FFFFFF"/>
+        <w:spacing w:before="90" w:after="0" w:line="480" w:lineRule="auto"/>
+        <w:ind w:firstLine="504"/>
+        <w:jc w:val="both"/>
+        <w:rPr>
+          <w:rFonts w:ascii="Times New Roman" w:eastAsia="Times New Roman" w:hAnsi="Times New Roman" w:cs="Times New Roman"/>
+          <w:color w:val="111111"/>
+          <w:kern w:val="0"/>
+          <w14:ligatures w14:val="none"/>
+        </w:rPr>
+      </w:pPr>
+    </w:p>
+    <w:p>
+      <w:pPr>
+        <w:spacing w:after="0" w:line="480" w:lineRule="auto"/>
+        <w:rPr>
+          <w:rFonts w:ascii="Times New Roman" w:eastAsia="Times New Roman" w:hAnsi="Times New Roman" w:cs="Times New Roman"/>
+          <w:kern w:val="0"/>
+          <w14:ligatures w14:val="none"/>
+        </w:rPr>
+      </w:pPr>
     </w:p>
     <w:p>
       <w:pPr>
@@ -1822,7 +1567,6 @@
     <w:next w:val="Normal"/>
     <w:link w:val="Heading3Char"/>
     <w:uiPriority w:val="9"/>
-    <w:semiHidden/>
     <w:unhideWhenUsed/>
     <w:qFormat/>
     <w:rsid w:val="003A3950"/>
@@ -2030,7 +1774,6 @@
     <w:basedOn w:val="DefaultParagraphFont"/>
     <w:link w:val="Heading3"/>
     <w:uiPriority w:val="9"/>
-    <w:semiHidden/>
     <w:rsid w:val="003A3950"/>
     <w:rPr>
       <w:rFonts w:eastAsiaTheme="majorEastAsia" w:cstheme="majorBidi"/>
@@ -2339,6 +2082,22 @@
     <w:semiHidden/>
     <w:unhideWhenUsed/>
     <w:rsid w:val="00931971"/>
+  </w:style>
+  <w:style w:type="paragraph" w:styleId="NormalWeb">
+    <w:name w:val="Normal (Web)"/>
+    <w:basedOn w:val="Normal"/>
+    <w:uiPriority w:val="99"/>
+    <w:semiHidden/>
+    <w:unhideWhenUsed/>
+    <w:rsid w:val="001805FA"/>
+    <w:pPr>
+      <w:spacing w:before="100" w:beforeAutospacing="1" w:after="100" w:afterAutospacing="1" w:line="240" w:lineRule="auto"/>
+    </w:pPr>
+    <w:rPr>
+      <w:rFonts w:ascii="Times New Roman" w:eastAsia="Times New Roman" w:hAnsi="Times New Roman" w:cs="Times New Roman"/>
+      <w:kern w:val="0"/>
+      <w14:ligatures w14:val="none"/>
+    </w:rPr>
   </w:style>
 </w:styles>
 </file>

</xml_diff>

<commit_message>
i think thats my executive summary
</commit_message>
<xml_diff>
--- a/Communications/Enterprise Software Maintenance.docx
+++ b/Communications/Enterprise Software Maintenance.docx
@@ -10,6 +10,7 @@
           <w:rFonts w:ascii="Times New Roman" w:hAnsi="Times New Roman" w:cs="Times New Roman"/>
         </w:rPr>
       </w:pPr>
+      <w:bookmarkStart w:id="0" w:name="OLE_LINK1"/>
     </w:p>
     <w:p>
       <w:pPr>
@@ -482,11 +483,15 @@
         <w:jc w:val="center"/>
         <w:rPr>
           <w:rFonts w:ascii="Times New Roman" w:hAnsi="Times New Roman" w:cs="Times New Roman"/>
-        </w:rPr>
-      </w:pPr>
-      <w:r>
-        <w:rPr>
-          <w:rFonts w:ascii="Times New Roman" w:hAnsi="Times New Roman" w:cs="Times New Roman"/>
+          <w:b/>
+          <w:bCs/>
+        </w:rPr>
+      </w:pPr>
+      <w:r>
+        <w:rPr>
+          <w:rFonts w:ascii="Times New Roman" w:hAnsi="Times New Roman" w:cs="Times New Roman"/>
+          <w:b/>
+          <w:bCs/>
         </w:rPr>
         <w:lastRenderedPageBreak/>
         <w:t>EXECUTIVE SUMMARY</w:t>
@@ -512,25 +517,88 @@
           <w:kern w:val="0"/>
           <w14:ligatures w14:val="none"/>
         </w:rPr>
-        <w:t>Technology that runs crucial industries</w:t>
-      </w:r>
-      <w:r>
-        <w:rPr>
-          <w:rFonts w:ascii="Times New Roman" w:eastAsia="Times New Roman" w:hAnsi="Times New Roman" w:cs="Times New Roman"/>
-          <w:color w:val="111111"/>
-          <w:kern w:val="0"/>
-          <w14:ligatures w14:val="none"/>
-        </w:rPr>
-        <w:t>—such as core banking transaction platforms, electronic healthcare databases, and public government administration networks—relies heavily on monolithic software architectures built between the 1970s and 1990s. While these systems have provided foundational reliability for decades, accumulated technical debt and a rapidly shrinking pool of legacy developers present severe operational risk.</w:t>
-      </w:r>
-      <w:r>
-        <w:rPr>
-          <w:rFonts w:ascii="Times New Roman" w:eastAsia="Times New Roman" w:hAnsi="Times New Roman" w:cs="Times New Roman"/>
-          <w:color w:val="111111"/>
-          <w:kern w:val="0"/>
-          <w14:ligatures w14:val="none"/>
-        </w:rPr>
-        <w:t xml:space="preserve"> As these programs age, bugs are discovered that become increasingly difficult and time-consuming to fix.</w:t>
+        <w:t xml:space="preserve">Technology that supports </w:t>
+      </w:r>
+      <w:r>
+        <w:rPr>
+          <w:rFonts w:ascii="Times New Roman" w:eastAsia="Times New Roman" w:hAnsi="Times New Roman" w:cs="Times New Roman"/>
+          <w:color w:val="111111"/>
+          <w:kern w:val="0"/>
+          <w14:ligatures w14:val="none"/>
+        </w:rPr>
+        <w:t>crucial</w:t>
+      </w:r>
+      <w:r>
+        <w:rPr>
+          <w:rFonts w:ascii="Times New Roman" w:eastAsia="Times New Roman" w:hAnsi="Times New Roman" w:cs="Times New Roman"/>
+          <w:color w:val="111111"/>
+          <w:kern w:val="0"/>
+          <w14:ligatures w14:val="none"/>
+        </w:rPr>
+        <w:t xml:space="preserve"> industries such as banking, healthcare, and </w:t>
+      </w:r>
+      <w:r>
+        <w:rPr>
+          <w:rFonts w:ascii="Times New Roman" w:eastAsia="Times New Roman" w:hAnsi="Times New Roman" w:cs="Times New Roman"/>
+          <w:color w:val="111111"/>
+          <w:kern w:val="0"/>
+          <w14:ligatures w14:val="none"/>
+        </w:rPr>
+        <w:t xml:space="preserve">the </w:t>
+      </w:r>
+      <w:r>
+        <w:rPr>
+          <w:rFonts w:ascii="Times New Roman" w:eastAsia="Times New Roman" w:hAnsi="Times New Roman" w:cs="Times New Roman"/>
+          <w:color w:val="111111"/>
+          <w:kern w:val="0"/>
+          <w14:ligatures w14:val="none"/>
+        </w:rPr>
+        <w:t xml:space="preserve">government </w:t>
+      </w:r>
+      <w:r>
+        <w:rPr>
+          <w:rFonts w:ascii="Times New Roman" w:eastAsia="Times New Roman" w:hAnsi="Times New Roman" w:cs="Times New Roman"/>
+          <w:color w:val="111111"/>
+          <w:kern w:val="0"/>
+          <w14:ligatures w14:val="none"/>
+        </w:rPr>
+        <w:t>mostly</w:t>
+      </w:r>
+      <w:r>
+        <w:rPr>
+          <w:rFonts w:ascii="Times New Roman" w:eastAsia="Times New Roman" w:hAnsi="Times New Roman" w:cs="Times New Roman"/>
+          <w:color w:val="111111"/>
+          <w:kern w:val="0"/>
+          <w14:ligatures w14:val="none"/>
+        </w:rPr>
+        <w:t xml:space="preserve"> rel</w:t>
+      </w:r>
+      <w:r>
+        <w:rPr>
+          <w:rFonts w:ascii="Times New Roman" w:eastAsia="Times New Roman" w:hAnsi="Times New Roman" w:cs="Times New Roman"/>
+          <w:color w:val="111111"/>
+          <w:kern w:val="0"/>
+          <w14:ligatures w14:val="none"/>
+        </w:rPr>
+        <w:t>ies</w:t>
+      </w:r>
+      <w:r>
+        <w:rPr>
+          <w:rFonts w:ascii="Times New Roman" w:eastAsia="Times New Roman" w:hAnsi="Times New Roman" w:cs="Times New Roman"/>
+          <w:color w:val="111111"/>
+          <w:kern w:val="0"/>
+          <w14:ligatures w14:val="none"/>
+        </w:rPr>
+        <w:t xml:space="preserve"> on monolithic software built from the 1970s through the 1990s. These systems have been reliable for years</w:t>
+      </w:r>
+      <w:r>
+        <w:rPr>
+          <w:rFonts w:ascii="Times New Roman" w:eastAsia="Times New Roman" w:hAnsi="Times New Roman" w:cs="Times New Roman"/>
+          <w:color w:val="111111"/>
+          <w:kern w:val="0"/>
+          <w14:ligatures w14:val="none"/>
+        </w:rPr>
+        <w:t>;</w:t>
       </w:r>
       <w:r>
         <w:rPr>
@@ -548,178 +616,72 @@
           <w:kern w:val="0"/>
           <w14:ligatures w14:val="none"/>
         </w:rPr>
-        <w:t xml:space="preserve">As the workforce for these programs shrinks, these bugs </w:t>
-      </w:r>
-      <w:r>
-        <w:rPr>
-          <w:rFonts w:ascii="Times New Roman" w:eastAsia="Times New Roman" w:hAnsi="Times New Roman" w:cs="Times New Roman"/>
-          <w:color w:val="111111"/>
-          <w:kern w:val="0"/>
-          <w14:ligatures w14:val="none"/>
-        </w:rPr>
-        <w:t xml:space="preserve">require more time and effort to fix to keep the program functional. </w:t>
-      </w:r>
-      <w:r>
-        <w:rPr>
-          <w:rFonts w:ascii="Times New Roman" w:eastAsia="Times New Roman" w:hAnsi="Times New Roman" w:cs="Times New Roman"/>
-          <w:color w:val="111111"/>
-          <w:kern w:val="0"/>
-          <w14:ligatures w14:val="none"/>
-        </w:rPr>
-        <w:t>O</w:t>
-      </w:r>
-      <w:r>
-        <w:rPr>
-          <w:rFonts w:ascii="Times New Roman" w:eastAsia="Times New Roman" w:hAnsi="Times New Roman" w:cs="Times New Roman"/>
-          <w:color w:val="111111"/>
-          <w:kern w:val="0"/>
-          <w14:ligatures w14:val="none"/>
-        </w:rPr>
-        <w:t xml:space="preserve">rganizations face a </w:t>
-      </w:r>
-      <w:r>
-        <w:rPr>
-          <w:rFonts w:ascii="Times New Roman" w:eastAsia="Times New Roman" w:hAnsi="Times New Roman" w:cs="Times New Roman"/>
-          <w:color w:val="111111"/>
-          <w:kern w:val="0"/>
-          <w14:ligatures w14:val="none"/>
-        </w:rPr>
-        <w:t>requirement</w:t>
-      </w:r>
-      <w:r>
-        <w:rPr>
-          <w:rFonts w:ascii="Times New Roman" w:eastAsia="Times New Roman" w:hAnsi="Times New Roman" w:cs="Times New Roman"/>
-          <w:color w:val="111111"/>
-          <w:kern w:val="0"/>
-          <w14:ligatures w14:val="none"/>
-        </w:rPr>
-        <w:t xml:space="preserve"> to refactor and modernize these monolithic systems without causing service disruption. </w:t>
-      </w:r>
-      <w:r>
-        <w:rPr>
-          <w:rFonts w:ascii="Times New Roman" w:eastAsia="Times New Roman" w:hAnsi="Times New Roman" w:cs="Times New Roman"/>
-          <w:color w:val="111111"/>
-          <w:kern w:val="0"/>
-          <w14:ligatures w14:val="none"/>
-        </w:rPr>
-        <w:t>However, a</w:t>
-      </w:r>
-      <w:r>
-        <w:rPr>
-          <w:rFonts w:ascii="Times New Roman" w:eastAsia="Times New Roman" w:hAnsi="Times New Roman" w:cs="Times New Roman"/>
-          <w:color w:val="111111"/>
-          <w:kern w:val="0"/>
-          <w14:ligatures w14:val="none"/>
-        </w:rPr>
-        <w:t xml:space="preserve"> complete "rip-and-replace" </w:t>
-      </w:r>
-      <w:r>
-        <w:rPr>
-          <w:rFonts w:ascii="Times New Roman" w:eastAsia="Times New Roman" w:hAnsi="Times New Roman" w:cs="Times New Roman"/>
-          <w:color w:val="111111"/>
-          <w:kern w:val="0"/>
-          <w14:ligatures w14:val="none"/>
-        </w:rPr>
-        <w:t>reconstruction</w:t>
-      </w:r>
-      <w:r>
-        <w:rPr>
-          <w:rFonts w:ascii="Times New Roman" w:eastAsia="Times New Roman" w:hAnsi="Times New Roman" w:cs="Times New Roman"/>
-          <w:color w:val="111111"/>
-          <w:kern w:val="0"/>
-          <w14:ligatures w14:val="none"/>
-        </w:rPr>
-        <w:t xml:space="preserve"> would </w:t>
-      </w:r>
-      <w:r>
-        <w:rPr>
-          <w:rFonts w:ascii="Times New Roman" w:eastAsia="Times New Roman" w:hAnsi="Times New Roman" w:cs="Times New Roman"/>
-          <w:color w:val="111111"/>
-          <w:kern w:val="0"/>
-          <w14:ligatures w14:val="none"/>
-        </w:rPr>
-        <w:t>result in</w:t>
-      </w:r>
-      <w:r>
-        <w:rPr>
-          <w:rFonts w:ascii="Times New Roman" w:eastAsia="Times New Roman" w:hAnsi="Times New Roman" w:cs="Times New Roman"/>
-          <w:color w:val="111111"/>
-          <w:kern w:val="0"/>
-          <w14:ligatures w14:val="none"/>
-        </w:rPr>
-        <w:t xml:space="preserve"> unacceptable downtime and is too risky</w:t>
-      </w:r>
-      <w:r>
-        <w:rPr>
-          <w:rFonts w:ascii="Times New Roman" w:eastAsia="Times New Roman" w:hAnsi="Times New Roman" w:cs="Times New Roman"/>
-          <w:color w:val="111111"/>
-          <w:kern w:val="0"/>
-          <w14:ligatures w14:val="none"/>
-        </w:rPr>
-        <w:t xml:space="preserve"> to be viable</w:t>
-      </w:r>
-      <w:r>
-        <w:rPr>
-          <w:rFonts w:ascii="Times New Roman" w:eastAsia="Times New Roman" w:hAnsi="Times New Roman" w:cs="Times New Roman"/>
-          <w:color w:val="111111"/>
-          <w:kern w:val="0"/>
-          <w14:ligatures w14:val="none"/>
-        </w:rPr>
-        <w:t xml:space="preserve">. Instead, organizations must implement incremental migration architectures, specifically the Strangler Fig pattern, </w:t>
-      </w:r>
-      <w:r>
-        <w:rPr>
-          <w:rFonts w:ascii="Times New Roman" w:eastAsia="Times New Roman" w:hAnsi="Times New Roman" w:cs="Times New Roman"/>
-          <w:color w:val="111111"/>
-          <w:kern w:val="0"/>
-          <w14:ligatures w14:val="none"/>
-        </w:rPr>
-        <w:t xml:space="preserve">along </w:t>
-      </w:r>
-      <w:r>
-        <w:rPr>
-          <w:rFonts w:ascii="Times New Roman" w:eastAsia="Times New Roman" w:hAnsi="Times New Roman" w:cs="Times New Roman"/>
-          <w:color w:val="111111"/>
-          <w:kern w:val="0"/>
-          <w14:ligatures w14:val="none"/>
-        </w:rPr>
-        <w:t>with structured</w:t>
-      </w:r>
-      <w:r>
-        <w:rPr>
-          <w:rFonts w:ascii="Times New Roman" w:eastAsia="Times New Roman" w:hAnsi="Times New Roman" w:cs="Times New Roman"/>
-          <w:color w:val="111111"/>
-          <w:kern w:val="0"/>
-          <w14:ligatures w14:val="none"/>
-        </w:rPr>
-        <w:t xml:space="preserve"> knowledge transfer </w:t>
-      </w:r>
-      <w:r>
-        <w:rPr>
-          <w:rFonts w:ascii="Times New Roman" w:eastAsia="Times New Roman" w:hAnsi="Times New Roman" w:cs="Times New Roman"/>
-          <w:color w:val="111111"/>
-          <w:kern w:val="0"/>
-          <w14:ligatures w14:val="none"/>
-        </w:rPr>
-        <w:t>and modern staffing</w:t>
-      </w:r>
-      <w:r>
-        <w:rPr>
-          <w:rFonts w:ascii="Times New Roman" w:eastAsia="Times New Roman" w:hAnsi="Times New Roman" w:cs="Times New Roman"/>
-          <w:color w:val="111111"/>
-          <w:kern w:val="0"/>
-          <w14:ligatures w14:val="none"/>
-        </w:rPr>
-        <w:t xml:space="preserve"> to ensure long-term </w:t>
-      </w:r>
-      <w:r>
-        <w:rPr>
-          <w:rFonts w:ascii="Times New Roman" w:eastAsia="Times New Roman" w:hAnsi="Times New Roman" w:cs="Times New Roman"/>
-          <w:color w:val="111111"/>
-          <w:kern w:val="0"/>
-          <w14:ligatures w14:val="none"/>
-        </w:rPr>
-        <w:t>resilience of the system</w:t>
+        <w:t>however,</w:t>
+      </w:r>
+      <w:r>
+        <w:rPr>
+          <w:rFonts w:ascii="Times New Roman" w:eastAsia="Times New Roman" w:hAnsi="Times New Roman" w:cs="Times New Roman"/>
+          <w:color w:val="111111"/>
+          <w:kern w:val="0"/>
+          <w14:ligatures w14:val="none"/>
+        </w:rPr>
+        <w:t xml:space="preserve"> growing technical debt and a shrinking pool of legacy developers now pose serious risks. As these systems age and the workforce shrinks, bug fixes take longer and require more effort. Organizations need to update and refactor these systems without disrupting services.</w:t>
+      </w:r>
+      <w:r>
+        <w:rPr>
+          <w:rFonts w:ascii="Times New Roman" w:eastAsia="Times New Roman" w:hAnsi="Times New Roman" w:cs="Times New Roman"/>
+          <w:color w:val="111111"/>
+          <w:kern w:val="0"/>
+          <w14:ligatures w14:val="none"/>
+        </w:rPr>
+        <w:t xml:space="preserve"> If industries were to “rip and replace” the software supporting these systems, to avoid a complete shutdown, they would need to keep the monolith running</w:t>
+      </w:r>
+      <w:r>
+        <w:rPr>
+          <w:rFonts w:ascii="Times New Roman" w:eastAsia="Times New Roman" w:hAnsi="Times New Roman" w:cs="Times New Roman"/>
+          <w:color w:val="111111"/>
+          <w:kern w:val="0"/>
+          <w14:ligatures w14:val="none"/>
+        </w:rPr>
+        <w:t xml:space="preserve"> and staffed, while also having a separate team to build the new system. This would stretch company budgets to keep the old monolith running and finding a team that has the knowledge </w:t>
+      </w:r>
+      <w:r>
+        <w:rPr>
+          <w:rFonts w:ascii="Times New Roman" w:eastAsia="Times New Roman" w:hAnsi="Times New Roman" w:cs="Times New Roman"/>
+          <w:color w:val="111111"/>
+          <w:kern w:val="0"/>
+          <w14:ligatures w14:val="none"/>
+        </w:rPr>
+        <w:t>and</w:t>
+      </w:r>
+      <w:r>
+        <w:rPr>
+          <w:rFonts w:ascii="Times New Roman" w:eastAsia="Times New Roman" w:hAnsi="Times New Roman" w:cs="Times New Roman"/>
+          <w:color w:val="111111"/>
+          <w:kern w:val="0"/>
+          <w14:ligatures w14:val="none"/>
+        </w:rPr>
+        <w:t xml:space="preserve"> ability to create a system that functions as well as the old monolith </w:t>
+      </w:r>
+      <w:r>
+        <w:rPr>
+          <w:rFonts w:ascii="Times New Roman" w:hAnsi="Times New Roman" w:cs="Times New Roman"/>
+        </w:rPr>
+        <w:t>(</w:t>
+      </w:r>
+      <w:proofErr w:type="spellStart"/>
+      <w:r>
+        <w:rPr>
+          <w:rFonts w:ascii="Times New Roman" w:hAnsi="Times New Roman" w:cs="Times New Roman"/>
+        </w:rPr>
+        <w:t>Litvinau</w:t>
+      </w:r>
+      <w:proofErr w:type="spellEnd"/>
+      <w:r>
+        <w:rPr>
+          <w:rFonts w:ascii="Times New Roman" w:hAnsi="Times New Roman" w:cs="Times New Roman"/>
+        </w:rPr>
+        <w:t>, 2026)</w:t>
       </w:r>
       <w:r>
         <w:rPr>
@@ -729,6 +691,15 @@
           <w14:ligatures w14:val="none"/>
         </w:rPr>
         <w:t>.</w:t>
+      </w:r>
+      <w:r>
+        <w:rPr>
+          <w:rFonts w:ascii="Times New Roman" w:eastAsia="Times New Roman" w:hAnsi="Times New Roman" w:cs="Times New Roman"/>
+          <w:color w:val="111111"/>
+          <w:kern w:val="0"/>
+          <w14:ligatures w14:val="none"/>
+        </w:rPr>
+        <w:t xml:space="preserve"> Replacing everything at once would cause excessive downtime and is too risky. A better approach is to update the architecture gradually, using the Strangler Fig pattern. This should be paired with structured knowledge transfer and modern staffing to keep the system resilient over time.</w:t>
       </w:r>
     </w:p>
     <w:p>
@@ -777,76 +748,24 @@
           <w:kern w:val="0"/>
           <w14:ligatures w14:val="none"/>
         </w:rPr>
-        <w:t>Decades of patch-based maintenance have created fragile, highly coupled legacy codebases</w:t>
-      </w:r>
-      <w:r>
-        <w:rPr>
-          <w:rFonts w:ascii="Times New Roman" w:eastAsia="Times New Roman" w:hAnsi="Times New Roman" w:cs="Times New Roman"/>
-          <w:color w:val="111111"/>
-          <w:kern w:val="0"/>
-          <w14:ligatures w14:val="none"/>
-        </w:rPr>
-        <w:t>, which means modifying code could break unrelated code in other areas.</w:t>
-      </w:r>
-      <w:r>
-        <w:rPr>
-          <w:rFonts w:ascii="Times New Roman" w:eastAsia="Times New Roman" w:hAnsi="Times New Roman" w:cs="Times New Roman"/>
-          <w:color w:val="111111"/>
-          <w:kern w:val="0"/>
-          <w14:ligatures w14:val="none"/>
-        </w:rPr>
-        <w:t xml:space="preserve"> </w:t>
-      </w:r>
-      <w:r>
-        <w:rPr>
-          <w:rFonts w:ascii="Times New Roman" w:hAnsi="Times New Roman" w:cs="Times New Roman"/>
-        </w:rPr>
-        <w:t xml:space="preserve">At its core, the problem </w:t>
-      </w:r>
-      <w:r>
-        <w:rPr>
-          <w:rFonts w:ascii="Times New Roman" w:hAnsi="Times New Roman" w:cs="Times New Roman"/>
-        </w:rPr>
-        <w:t>stems from</w:t>
-      </w:r>
-      <w:r>
-        <w:rPr>
-          <w:rFonts w:ascii="Times New Roman" w:hAnsi="Times New Roman" w:cs="Times New Roman"/>
-        </w:rPr>
-        <w:t xml:space="preserve"> two main issues: outdated technology that is difficult to modernize, and a serious lack of specialized talent</w:t>
-      </w:r>
-      <w:r>
-        <w:rPr>
-          <w:rFonts w:ascii="Times New Roman" w:hAnsi="Times New Roman" w:cs="Times New Roman"/>
-        </w:rPr>
-        <w:t xml:space="preserve"> to work on </w:t>
-      </w:r>
-      <w:r>
-        <w:rPr>
-          <w:rFonts w:ascii="Times New Roman" w:hAnsi="Times New Roman" w:cs="Times New Roman"/>
-        </w:rPr>
-        <w:t>these programs</w:t>
-      </w:r>
-      <w:r>
-        <w:rPr>
-          <w:rFonts w:ascii="Times New Roman" w:hAnsi="Times New Roman" w:cs="Times New Roman"/>
-        </w:rPr>
-        <w:t>.</w:t>
-      </w:r>
-      <w:r>
-        <w:rPr>
-          <w:rFonts w:ascii="Times New Roman" w:hAnsi="Times New Roman" w:cs="Times New Roman"/>
-        </w:rPr>
-        <w:t xml:space="preserve"> </w:t>
-      </w:r>
-      <w:r>
-        <w:rPr>
-          <w:rFonts w:ascii="Times New Roman" w:eastAsia="Times New Roman" w:hAnsi="Times New Roman" w:cs="Times New Roman"/>
-          <w:color w:val="111111"/>
-          <w:kern w:val="0"/>
-          <w14:ligatures w14:val="none"/>
-        </w:rPr>
-        <w:t xml:space="preserve">The engineers who originally designed these platforms are entering retirement, leaving organizations with insufficient staff who understand core domain logic (Emergent Staffing, 2026; </w:t>
+        <w:t xml:space="preserve">Years of patching have made legacy code fragile and tightly connected, so changing one part can break something else. </w:t>
+      </w:r>
+      <w:r>
+        <w:rPr>
+          <w:rFonts w:ascii="Times New Roman" w:hAnsi="Times New Roman" w:cs="Times New Roman"/>
+          <w:kern w:val="0"/>
+          <w14:ligatures w14:val="none"/>
+        </w:rPr>
+        <w:t xml:space="preserve">The main challenges are outdated technology that is hard to update and not enough skilled people to maintain these systems. </w:t>
+      </w:r>
+      <w:r>
+        <w:rPr>
+          <w:rFonts w:ascii="Times New Roman" w:eastAsia="Times New Roman" w:hAnsi="Times New Roman" w:cs="Times New Roman"/>
+          <w:color w:val="111111"/>
+          <w:kern w:val="0"/>
+          <w14:ligatures w14:val="none"/>
+        </w:rPr>
+        <w:t xml:space="preserve">Many of the original engineers are retiring, which leaves too few staff who understand the core logic (Emergent Staffing, 2026; </w:t>
       </w:r>
       <w:proofErr w:type="spellStart"/>
       <w:r>
@@ -866,34 +785,97 @@
           <w:kern w:val="0"/>
           <w14:ligatures w14:val="none"/>
         </w:rPr>
-        <w:t xml:space="preserve">, 2026). In </w:t>
-      </w:r>
-      <w:r>
-        <w:rPr>
-          <w:rFonts w:ascii="Times New Roman" w:eastAsia="Times New Roman" w:hAnsi="Times New Roman" w:cs="Times New Roman"/>
-          <w:color w:val="111111"/>
-          <w:kern w:val="0"/>
-          <w14:ligatures w14:val="none"/>
-        </w:rPr>
-        <w:t>core</w:t>
-      </w:r>
-      <w:r>
-        <w:rPr>
-          <w:rFonts w:ascii="Times New Roman" w:eastAsia="Times New Roman" w:hAnsi="Times New Roman" w:cs="Times New Roman"/>
-          <w:color w:val="111111"/>
-          <w:kern w:val="0"/>
-          <w14:ligatures w14:val="none"/>
-        </w:rPr>
-        <w:t xml:space="preserve"> environments—including banking systems processing daily transactions, electronic health record systems supporting patient safety, and government compliance platforms—any unplanned outage carries severe financial, legal, and operational consequences.</w:t>
-      </w:r>
-      <w:r>
-        <w:rPr>
-          <w:rFonts w:ascii="Times New Roman" w:eastAsia="Times New Roman" w:hAnsi="Times New Roman" w:cs="Times New Roman"/>
-          <w:color w:val="111111"/>
-          <w:kern w:val="0"/>
-          <w14:ligatures w14:val="none"/>
-        </w:rPr>
-        <w:t xml:space="preserve"> </w:t>
+        <w:t>, 2026). In places like banks, healthcare, and government, any unexpected outage can have serious financial, legal, and operational impacts.</w:t>
+      </w:r>
+    </w:p>
+    <w:p>
+      <w:pPr>
+        <w:shd w:val="clear" w:color="auto" w:fill="FFFFFF"/>
+        <w:spacing w:before="150" w:after="30" w:line="480" w:lineRule="auto"/>
+        <w:outlineLvl w:val="2"/>
+        <w:rPr>
+          <w:rFonts w:ascii="Times New Roman" w:eastAsia="Times New Roman" w:hAnsi="Times New Roman" w:cs="Times New Roman"/>
+          <w:b/>
+          <w:bCs/>
+          <w:color w:val="222222"/>
+          <w:kern w:val="0"/>
+          <w14:ligatures w14:val="none"/>
+        </w:rPr>
+      </w:pPr>
+      <w:r>
+        <w:rPr>
+          <w:rFonts w:ascii="Times New Roman" w:eastAsia="Times New Roman" w:hAnsi="Times New Roman" w:cs="Times New Roman"/>
+          <w:b/>
+          <w:bCs/>
+          <w:color w:val="222222"/>
+          <w:kern w:val="0"/>
+          <w14:ligatures w14:val="none"/>
+        </w:rPr>
+        <w:t>Strategic Migration &amp; Workforce Integration</w:t>
+      </w:r>
+    </w:p>
+    <w:p>
+      <w:pPr>
+        <w:shd w:val="clear" w:color="auto" w:fill="FFFFFF"/>
+        <w:spacing w:before="150" w:after="30" w:line="480" w:lineRule="auto"/>
+        <w:ind w:firstLine="720"/>
+        <w:outlineLvl w:val="2"/>
+        <w:rPr>
+          <w:rFonts w:ascii="Times New Roman" w:hAnsi="Times New Roman" w:cs="Times New Roman"/>
+        </w:rPr>
+      </w:pPr>
+      <w:r>
+        <w:rPr>
+          <w:rFonts w:ascii="Times New Roman" w:hAnsi="Times New Roman" w:cs="Times New Roman"/>
+          <w:kern w:val="0"/>
+          <w14:ligatures w14:val="none"/>
+        </w:rPr>
+        <w:lastRenderedPageBreak/>
+        <w:t>To avoid the risks of switching everything at once, organizations should use incremental refactoring, especially the Strangler Fig pattern (Fowler, 2004; Microsoft Azure, 2023). This involves adding a routing layer around the old system so teams can build and test new features as separate microservices. Once a feature works, live traffic is slowly moved from the old system to the new one until the legacy system can be retired (</w:t>
+      </w:r>
+      <w:proofErr w:type="spellStart"/>
+      <w:r>
+        <w:rPr>
+          <w:rFonts w:ascii="Times New Roman" w:hAnsi="Times New Roman" w:cs="Times New Roman"/>
+          <w:kern w:val="0"/>
+          <w14:ligatures w14:val="none"/>
+        </w:rPr>
+        <w:t>SoftSages</w:t>
+      </w:r>
+      <w:proofErr w:type="spellEnd"/>
+      <w:r>
+        <w:rPr>
+          <w:rFonts w:ascii="Times New Roman" w:hAnsi="Times New Roman" w:cs="Times New Roman"/>
+          <w:kern w:val="0"/>
+          <w14:ligatures w14:val="none"/>
+        </w:rPr>
+        <w:t>, 2026). Companies also need to address the people side by using hybrid teams (Emergent Staffing, 2026). Pairing experienced engineers with newer staff helps pass on important knowledge before experts retire, and hiring contractors for routine work lets internal teams focus on migration.</w:t>
+      </w:r>
+    </w:p>
+    <w:p>
+      <w:pPr>
+        <w:shd w:val="clear" w:color="auto" w:fill="FFFFFF"/>
+        <w:spacing w:before="150" w:after="30" w:line="480" w:lineRule="auto"/>
+        <w:outlineLvl w:val="2"/>
+        <w:rPr>
+          <w:rFonts w:ascii="Times New Roman" w:eastAsia="Times New Roman" w:hAnsi="Times New Roman" w:cs="Times New Roman"/>
+          <w:b/>
+          <w:bCs/>
+          <w:color w:val="222222"/>
+          <w:kern w:val="0"/>
+          <w14:ligatures w14:val="none"/>
+        </w:rPr>
+      </w:pPr>
+      <w:r>
+        <w:rPr>
+          <w:rFonts w:ascii="Times New Roman" w:eastAsia="Times New Roman" w:hAnsi="Times New Roman" w:cs="Times New Roman"/>
+          <w:b/>
+          <w:bCs/>
+          <w:color w:val="222222"/>
+          <w:kern w:val="0"/>
+          <w14:ligatures w14:val="none"/>
+        </w:rPr>
+        <w:t>Conclusions &amp; Recommendations</w:t>
       </w:r>
     </w:p>
     <w:p>
@@ -909,16 +891,501 @@
           <w14:ligatures w14:val="none"/>
         </w:rPr>
       </w:pPr>
-    </w:p>
-    <w:p>
-      <w:pPr>
-        <w:spacing w:after="0" w:line="480" w:lineRule="auto"/>
-        <w:rPr>
-          <w:rFonts w:ascii="Times New Roman" w:eastAsia="Times New Roman" w:hAnsi="Times New Roman" w:cs="Times New Roman"/>
-          <w:kern w:val="0"/>
-          <w14:ligatures w14:val="none"/>
-        </w:rPr>
-      </w:pPr>
+      <w:r>
+        <w:rPr>
+          <w:rFonts w:ascii="Times New Roman" w:eastAsia="Times New Roman" w:hAnsi="Times New Roman" w:cs="Times New Roman"/>
+          <w:color w:val="111111"/>
+          <w:kern w:val="0"/>
+          <w14:ligatures w14:val="none"/>
+        </w:rPr>
+        <w:t xml:space="preserve">To ensure continuous operational availability while eliminating technical debt, </w:t>
+      </w:r>
+      <w:r>
+        <w:rPr>
+          <w:rFonts w:ascii="Times New Roman" w:eastAsia="Times New Roman" w:hAnsi="Times New Roman" w:cs="Times New Roman"/>
+          <w:color w:val="111111"/>
+          <w:kern w:val="0"/>
+          <w14:ligatures w14:val="none"/>
+        </w:rPr>
+        <w:t>industry</w:t>
+      </w:r>
+      <w:r>
+        <w:rPr>
+          <w:rFonts w:ascii="Times New Roman" w:eastAsia="Times New Roman" w:hAnsi="Times New Roman" w:cs="Times New Roman"/>
+          <w:color w:val="111111"/>
+          <w:kern w:val="0"/>
+          <w14:ligatures w14:val="none"/>
+        </w:rPr>
+        <w:t xml:space="preserve"> leaders should adopt three </w:t>
+      </w:r>
+      <w:r>
+        <w:rPr>
+          <w:rFonts w:ascii="Times New Roman" w:eastAsia="Times New Roman" w:hAnsi="Times New Roman" w:cs="Times New Roman"/>
+          <w:color w:val="111111"/>
+          <w:kern w:val="0"/>
+          <w14:ligatures w14:val="none"/>
+        </w:rPr>
+        <w:t>main</w:t>
+      </w:r>
+      <w:r>
+        <w:rPr>
+          <w:rFonts w:ascii="Times New Roman" w:eastAsia="Times New Roman" w:hAnsi="Times New Roman" w:cs="Times New Roman"/>
+          <w:color w:val="111111"/>
+          <w:kern w:val="0"/>
+          <w14:ligatures w14:val="none"/>
+        </w:rPr>
+        <w:t xml:space="preserve"> </w:t>
+      </w:r>
+      <w:r>
+        <w:rPr>
+          <w:rFonts w:ascii="Times New Roman" w:eastAsia="Times New Roman" w:hAnsi="Times New Roman" w:cs="Times New Roman"/>
+          <w:color w:val="111111"/>
+          <w:kern w:val="0"/>
+          <w14:ligatures w14:val="none"/>
+        </w:rPr>
+        <w:t>techniques</w:t>
+      </w:r>
+      <w:r>
+        <w:rPr>
+          <w:rFonts w:ascii="Times New Roman" w:eastAsia="Times New Roman" w:hAnsi="Times New Roman" w:cs="Times New Roman"/>
+          <w:color w:val="111111"/>
+          <w:kern w:val="0"/>
+          <w14:ligatures w14:val="none"/>
+        </w:rPr>
+        <w:t>:</w:t>
+      </w:r>
+    </w:p>
+    <w:p>
+      <w:pPr>
+        <w:shd w:val="clear" w:color="auto" w:fill="FFFFFF"/>
+        <w:spacing w:before="210" w:after="0" w:line="480" w:lineRule="auto"/>
+        <w:ind w:firstLine="504"/>
+        <w:jc w:val="both"/>
+        <w:rPr>
+          <w:rFonts w:ascii="Times New Roman" w:eastAsia="Times New Roman" w:hAnsi="Times New Roman" w:cs="Times New Roman"/>
+          <w:color w:val="111111"/>
+          <w:kern w:val="0"/>
+          <w14:ligatures w14:val="none"/>
+        </w:rPr>
+      </w:pPr>
+      <w:r>
+        <w:rPr>
+          <w:rFonts w:ascii="Times New Roman" w:eastAsia="Times New Roman" w:hAnsi="Times New Roman" w:cs="Times New Roman"/>
+          <w:color w:val="111111"/>
+          <w:kern w:val="0"/>
+          <w14:ligatures w14:val="none"/>
+        </w:rPr>
+        <w:t>1.</w:t>
+      </w:r>
+      <w:r>
+        <w:rPr>
+          <w:rFonts w:ascii="Times New Roman" w:eastAsia="Times New Roman" w:hAnsi="Times New Roman" w:cs="Times New Roman"/>
+          <w:b/>
+          <w:bCs/>
+          <w:color w:val="111111"/>
+          <w:kern w:val="0"/>
+          <w14:ligatures w14:val="none"/>
+        </w:rPr>
+        <w:t xml:space="preserve"> </w:t>
+      </w:r>
+      <w:r>
+        <w:rPr>
+          <w:rFonts w:ascii="Times New Roman" w:eastAsia="Times New Roman" w:hAnsi="Times New Roman" w:cs="Times New Roman"/>
+          <w:b/>
+          <w:bCs/>
+          <w:color w:val="111111"/>
+          <w:kern w:val="0"/>
+          <w14:ligatures w14:val="none"/>
+        </w:rPr>
+        <w:t>Prioritize Incremental Refactoring:</w:t>
+      </w:r>
+      <w:r>
+        <w:rPr>
+          <w:rFonts w:ascii="Times New Roman" w:eastAsia="Times New Roman" w:hAnsi="Times New Roman" w:cs="Times New Roman"/>
+          <w:color w:val="111111"/>
+          <w:kern w:val="0"/>
+          <w14:ligatures w14:val="none"/>
+        </w:rPr>
+        <w:t xml:space="preserve"> Utilize the Strangler Fig pattern to migrate capabilities gradually, avoiding high-risk, all-at-once replacements (Fowler, 2004; Microsoft Azure, 2023).</w:t>
+      </w:r>
+    </w:p>
+    <w:p>
+      <w:pPr>
+        <w:shd w:val="clear" w:color="auto" w:fill="FFFFFF"/>
+        <w:spacing w:before="210" w:after="0" w:line="480" w:lineRule="auto"/>
+        <w:ind w:firstLine="504"/>
+        <w:jc w:val="both"/>
+        <w:rPr>
+          <w:rFonts w:ascii="Times New Roman" w:eastAsia="Times New Roman" w:hAnsi="Times New Roman" w:cs="Times New Roman"/>
+          <w:color w:val="111111"/>
+          <w:kern w:val="0"/>
+          <w14:ligatures w14:val="none"/>
+        </w:rPr>
+      </w:pPr>
+      <w:r>
+        <w:rPr>
+          <w:rFonts w:ascii="Times New Roman" w:eastAsia="Times New Roman" w:hAnsi="Times New Roman" w:cs="Times New Roman"/>
+          <w:color w:val="111111"/>
+          <w:kern w:val="0"/>
+          <w14:ligatures w14:val="none"/>
+        </w:rPr>
+        <w:t xml:space="preserve">2. </w:t>
+      </w:r>
+      <w:r>
+        <w:rPr>
+          <w:rFonts w:ascii="Times New Roman" w:eastAsia="Times New Roman" w:hAnsi="Times New Roman" w:cs="Times New Roman"/>
+          <w:b/>
+          <w:bCs/>
+          <w:color w:val="111111"/>
+          <w:kern w:val="0"/>
+          <w14:ligatures w14:val="none"/>
+        </w:rPr>
+        <w:t>Implement Proactive Knowledge Management:</w:t>
+      </w:r>
+      <w:r>
+        <w:rPr>
+          <w:rFonts w:ascii="Times New Roman" w:eastAsia="Times New Roman" w:hAnsi="Times New Roman" w:cs="Times New Roman"/>
+          <w:color w:val="111111"/>
+          <w:kern w:val="0"/>
+          <w14:ligatures w14:val="none"/>
+        </w:rPr>
+        <w:t xml:space="preserve"> Establish formal mentorship programs and pair</w:t>
+      </w:r>
+      <w:r>
+        <w:rPr>
+          <w:rFonts w:ascii="Times New Roman" w:eastAsia="Times New Roman" w:hAnsi="Times New Roman" w:cs="Times New Roman"/>
+          <w:color w:val="111111"/>
+          <w:kern w:val="0"/>
+          <w14:ligatures w14:val="none"/>
+        </w:rPr>
+        <w:t xml:space="preserve"> </w:t>
+      </w:r>
+      <w:r>
+        <w:rPr>
+          <w:rFonts w:ascii="Times New Roman" w:eastAsia="Times New Roman" w:hAnsi="Times New Roman" w:cs="Times New Roman"/>
+          <w:color w:val="111111"/>
+          <w:kern w:val="0"/>
+          <w14:ligatures w14:val="none"/>
+        </w:rPr>
+        <w:t xml:space="preserve">programming to capture institutional legacy knowledge </w:t>
+      </w:r>
+      <w:r>
+        <w:rPr>
+          <w:rFonts w:ascii="Times New Roman" w:eastAsia="Times New Roman" w:hAnsi="Times New Roman" w:cs="Times New Roman"/>
+          <w:color w:val="111111"/>
+          <w:kern w:val="0"/>
+          <w14:ligatures w14:val="none"/>
+        </w:rPr>
+        <w:t>before</w:t>
+      </w:r>
+      <w:r>
+        <w:rPr>
+          <w:rFonts w:ascii="Times New Roman" w:eastAsia="Times New Roman" w:hAnsi="Times New Roman" w:cs="Times New Roman"/>
+          <w:color w:val="111111"/>
+          <w:kern w:val="0"/>
+          <w14:ligatures w14:val="none"/>
+        </w:rPr>
+        <w:t xml:space="preserve"> expert retirement (Emergent Staffing, 2026).</w:t>
+      </w:r>
+    </w:p>
+    <w:p>
+      <w:pPr>
+        <w:shd w:val="clear" w:color="auto" w:fill="FFFFFF"/>
+        <w:spacing w:before="210" w:after="0" w:line="480" w:lineRule="auto"/>
+        <w:ind w:firstLine="504"/>
+        <w:jc w:val="both"/>
+        <w:rPr>
+          <w:rFonts w:ascii="Times New Roman" w:eastAsia="Times New Roman" w:hAnsi="Times New Roman" w:cs="Times New Roman"/>
+          <w:color w:val="111111"/>
+          <w:kern w:val="0"/>
+          <w14:ligatures w14:val="none"/>
+        </w:rPr>
+      </w:pPr>
+      <w:r>
+        <w:rPr>
+          <w:rFonts w:ascii="Times New Roman" w:eastAsia="Times New Roman" w:hAnsi="Times New Roman" w:cs="Times New Roman"/>
+          <w:color w:val="111111"/>
+          <w:kern w:val="0"/>
+          <w14:ligatures w14:val="none"/>
+        </w:rPr>
+        <w:t xml:space="preserve">3. </w:t>
+      </w:r>
+      <w:r>
+        <w:rPr>
+          <w:rFonts w:ascii="Times New Roman" w:eastAsia="Times New Roman" w:hAnsi="Times New Roman" w:cs="Times New Roman"/>
+          <w:b/>
+          <w:bCs/>
+          <w:color w:val="111111"/>
+          <w:kern w:val="0"/>
+          <w14:ligatures w14:val="none"/>
+        </w:rPr>
+        <w:t>Conduct Automated Code &amp; Dependency Audits:</w:t>
+      </w:r>
+      <w:r>
+        <w:rPr>
+          <w:rFonts w:ascii="Times New Roman" w:eastAsia="Times New Roman" w:hAnsi="Times New Roman" w:cs="Times New Roman"/>
+          <w:color w:val="111111"/>
+          <w:kern w:val="0"/>
+          <w14:ligatures w14:val="none"/>
+        </w:rPr>
+        <w:t xml:space="preserve"> Map legacy interdependencies to isolate low-risk domains for initial migration phases (</w:t>
+      </w:r>
+      <w:proofErr w:type="spellStart"/>
+      <w:r>
+        <w:rPr>
+          <w:rFonts w:ascii="Times New Roman" w:eastAsia="Times New Roman" w:hAnsi="Times New Roman" w:cs="Times New Roman"/>
+          <w:color w:val="111111"/>
+          <w:kern w:val="0"/>
+          <w14:ligatures w14:val="none"/>
+        </w:rPr>
+        <w:t>SoftSages</w:t>
+      </w:r>
+      <w:proofErr w:type="spellEnd"/>
+      <w:r>
+        <w:rPr>
+          <w:rFonts w:ascii="Times New Roman" w:eastAsia="Times New Roman" w:hAnsi="Times New Roman" w:cs="Times New Roman"/>
+          <w:color w:val="111111"/>
+          <w:kern w:val="0"/>
+          <w14:ligatures w14:val="none"/>
+        </w:rPr>
+        <w:t>, 2026).</w:t>
+      </w:r>
+    </w:p>
+    <w:bookmarkEnd w:id="0"/>
+    <w:p>
+      <w:pPr>
+        <w:spacing w:line="480" w:lineRule="auto"/>
+        <w:contextualSpacing/>
+        <w:rPr>
+          <w:rFonts w:ascii="Times New Roman" w:hAnsi="Times New Roman" w:cs="Times New Roman"/>
+        </w:rPr>
+      </w:pPr>
+    </w:p>
+    <w:p>
+      <w:pPr>
+        <w:spacing w:line="480" w:lineRule="auto"/>
+        <w:contextualSpacing/>
+        <w:rPr>
+          <w:rFonts w:ascii="Times New Roman" w:hAnsi="Times New Roman" w:cs="Times New Roman"/>
+        </w:rPr>
+      </w:pPr>
+    </w:p>
+    <w:p>
+      <w:pPr>
+        <w:spacing w:line="480" w:lineRule="auto"/>
+        <w:contextualSpacing/>
+        <w:rPr>
+          <w:rFonts w:ascii="Times New Roman" w:hAnsi="Times New Roman" w:cs="Times New Roman"/>
+        </w:rPr>
+      </w:pPr>
+    </w:p>
+    <w:p>
+      <w:pPr>
+        <w:spacing w:line="480" w:lineRule="auto"/>
+        <w:contextualSpacing/>
+        <w:rPr>
+          <w:rFonts w:ascii="Times New Roman" w:hAnsi="Times New Roman" w:cs="Times New Roman"/>
+        </w:rPr>
+      </w:pPr>
+    </w:p>
+    <w:p>
+      <w:pPr>
+        <w:spacing w:line="480" w:lineRule="auto"/>
+        <w:contextualSpacing/>
+        <w:rPr>
+          <w:rFonts w:ascii="Times New Roman" w:hAnsi="Times New Roman" w:cs="Times New Roman"/>
+          <w:b/>
+          <w:bCs/>
+        </w:rPr>
+      </w:pPr>
+      <w:r>
+        <w:rPr>
+          <w:rFonts w:ascii="Times New Roman" w:hAnsi="Times New Roman" w:cs="Times New Roman"/>
+          <w:b/>
+          <w:bCs/>
+        </w:rPr>
+        <w:t>Works Cited:</w:t>
+      </w:r>
+    </w:p>
+    <w:p>
+      <w:pPr>
+        <w:pStyle w:val="NormalWeb"/>
+        <w:spacing w:before="0" w:beforeAutospacing="0" w:after="0" w:afterAutospacing="0" w:line="480" w:lineRule="auto"/>
+        <w:ind w:left="720" w:hanging="720"/>
+      </w:pPr>
+      <w:proofErr w:type="spellStart"/>
+      <w:r>
+        <w:t>Litvinau</w:t>
+      </w:r>
+      <w:proofErr w:type="spellEnd"/>
+      <w:r>
+        <w:t xml:space="preserve">, E. (2026, January 21). </w:t>
+      </w:r>
+      <w:r>
+        <w:rPr>
+          <w:i/>
+          <w:iCs/>
+        </w:rPr>
+        <w:t>Modernizing government systems without replacing them</w:t>
+      </w:r>
+      <w:r>
+        <w:t xml:space="preserve">. </w:t>
+      </w:r>
+      <w:proofErr w:type="spellStart"/>
+      <w:r>
+        <w:t>SpruceID</w:t>
+      </w:r>
+      <w:proofErr w:type="spellEnd"/>
+      <w:r>
+        <w:t xml:space="preserve">. </w:t>
+      </w:r>
+      <w:r>
+        <w:rPr>
+          <w:rStyle w:val="url"/>
+        </w:rPr>
+        <w:t>https://blog.spruceid.com/modernizing-government-systems-without-replacing-them/</w:t>
+      </w:r>
+    </w:p>
+    <w:p>
+      <w:pPr>
+        <w:pStyle w:val="NormalWeb"/>
+        <w:spacing w:before="0" w:beforeAutospacing="0" w:after="0" w:afterAutospacing="0" w:line="480" w:lineRule="auto"/>
+        <w:ind w:left="720" w:hanging="720"/>
+      </w:pPr>
+      <w:r>
+        <w:rPr>
+          <w:i/>
+          <w:iCs/>
+        </w:rPr>
+        <w:t>Legacy System modernization: plan for your team’s capacity</w:t>
+      </w:r>
+      <w:r>
+        <w:t xml:space="preserve">. (n.d.). Emergent Staffing. </w:t>
+      </w:r>
+      <w:r>
+        <w:rPr>
+          <w:rStyle w:val="url"/>
+        </w:rPr>
+        <w:t>https://www.emergentstaffing.net/resources/legacy-system-modernization-the-hidden-staffing-challenge/</w:t>
+      </w:r>
+    </w:p>
+    <w:p>
+      <w:pPr>
+        <w:pStyle w:val="NormalWeb"/>
+        <w:spacing w:before="0" w:beforeAutospacing="0" w:after="0" w:afterAutospacing="0" w:line="480" w:lineRule="auto"/>
+        <w:ind w:left="720" w:hanging="720"/>
+      </w:pPr>
+      <w:r>
+        <w:t xml:space="preserve">Technology, S. (2026, August 27). Legacy System Modernization Strategies: A Practical Guide. </w:t>
+      </w:r>
+      <w:proofErr w:type="spellStart"/>
+      <w:r>
+        <w:rPr>
+          <w:i/>
+          <w:iCs/>
+        </w:rPr>
+        <w:t>SoftSages</w:t>
+      </w:r>
+      <w:proofErr w:type="spellEnd"/>
+      <w:r>
+        <w:rPr>
+          <w:i/>
+          <w:iCs/>
+        </w:rPr>
+        <w:t xml:space="preserve"> Technology</w:t>
+      </w:r>
+      <w:r>
+        <w:t xml:space="preserve">. </w:t>
+      </w:r>
+      <w:r>
+        <w:rPr>
+          <w:rStyle w:val="url"/>
+        </w:rPr>
+        <w:t>https://www.softsages.com/blogs/legacy-system-modernization-strategies/</w:t>
+      </w:r>
+    </w:p>
+    <w:p>
+      <w:pPr>
+        <w:pStyle w:val="NormalWeb"/>
+        <w:spacing w:before="0" w:beforeAutospacing="0" w:after="0" w:afterAutospacing="0" w:line="480" w:lineRule="auto"/>
+        <w:ind w:left="720" w:hanging="720"/>
+      </w:pPr>
+      <w:r>
+        <w:t xml:space="preserve">Fowler, M. (n.d.). </w:t>
+      </w:r>
+      <w:r>
+        <w:rPr>
+          <w:i/>
+          <w:iCs/>
+        </w:rPr>
+        <w:t>bliki: Strangler Fig</w:t>
+      </w:r>
+      <w:r>
+        <w:t xml:space="preserve">. martinfowler.com. </w:t>
+      </w:r>
+      <w:r>
+        <w:rPr>
+          <w:rStyle w:val="url"/>
+        </w:rPr>
+        <w:t>https://martinfowler.com/bliki/StranglerFigApplication.html</w:t>
+      </w:r>
+    </w:p>
+    <w:p>
+      <w:pPr>
+        <w:pStyle w:val="NormalWeb"/>
+        <w:spacing w:before="0" w:beforeAutospacing="0" w:after="0" w:afterAutospacing="0" w:line="480" w:lineRule="auto"/>
+        <w:ind w:left="720" w:hanging="720"/>
+      </w:pPr>
+      <w:proofErr w:type="spellStart"/>
+      <w:r>
+        <w:t>Ovaismehboob</w:t>
+      </w:r>
+      <w:proofErr w:type="spellEnd"/>
+      <w:r>
+        <w:t xml:space="preserve">. (n.d.). </w:t>
+      </w:r>
+      <w:r>
+        <w:rPr>
+          <w:i/>
+          <w:iCs/>
+        </w:rPr>
+        <w:t>Strangler Fig Pattern - Azure Architecture Center</w:t>
+      </w:r>
+      <w:r>
+        <w:t xml:space="preserve">. Microsoft Learn. </w:t>
+      </w:r>
+      <w:r>
+        <w:rPr>
+          <w:rStyle w:val="url"/>
+        </w:rPr>
+        <w:t>https://learn.microsoft.com/en-us/azure/architecture/patterns/strangler-fig</w:t>
+      </w:r>
+    </w:p>
+    <w:p>
+      <w:pPr>
+        <w:pStyle w:val="NormalWeb"/>
+        <w:spacing w:before="0" w:beforeAutospacing="0" w:after="0" w:afterAutospacing="0" w:line="480" w:lineRule="auto"/>
+        <w:ind w:left="720" w:hanging="720"/>
+      </w:pPr>
+      <w:r>
+        <w:t xml:space="preserve">Dodd, R. (2026, August 31). </w:t>
+      </w:r>
+      <w:r>
+        <w:rPr>
+          <w:i/>
+          <w:iCs/>
+        </w:rPr>
+        <w:t>Guide: What to know before migrating legacy, monolithic, or existing applications to microservices</w:t>
+      </w:r>
+      <w:r>
+        <w:t xml:space="preserve">. LaunchDarkly. </w:t>
+      </w:r>
+      <w:r>
+        <w:rPr>
+          <w:rStyle w:val="url"/>
+        </w:rPr>
+        <w:t>https://launchdarkly.com/blog/migrating-legacy-monolithic-applications-microservices/</w:t>
+      </w:r>
     </w:p>
     <w:p>
       <w:pPr>
@@ -2099,6 +2566,35 @@
       <w14:ligatures w14:val="none"/>
     </w:rPr>
   </w:style>
+  <w:style w:type="paragraph" w:customStyle="1" w:styleId="no-indent">
+    <w:name w:val="no-indent"/>
+    <w:basedOn w:val="Normal"/>
+    <w:rsid w:val="000B5B05"/>
+    <w:pPr>
+      <w:spacing w:before="100" w:beforeAutospacing="1" w:after="100" w:afterAutospacing="1" w:line="240" w:lineRule="auto"/>
+    </w:pPr>
+    <w:rPr>
+      <w:rFonts w:ascii="Times New Roman" w:eastAsia="Times New Roman" w:hAnsi="Times New Roman" w:cs="Times New Roman"/>
+      <w:kern w:val="0"/>
+      <w14:ligatures w14:val="none"/>
+    </w:rPr>
+  </w:style>
+  <w:style w:type="character" w:styleId="Strong">
+    <w:name w:val="Strong"/>
+    <w:basedOn w:val="DefaultParagraphFont"/>
+    <w:uiPriority w:val="22"/>
+    <w:qFormat/>
+    <w:rsid w:val="000B5B05"/>
+    <w:rPr>
+      <w:b/>
+      <w:bCs/>
+    </w:rPr>
+  </w:style>
+  <w:style w:type="character" w:customStyle="1" w:styleId="url">
+    <w:name w:val="url"/>
+    <w:basedOn w:val="DefaultParagraphFont"/>
+    <w:rsid w:val="00270ADD"/>
+  </w:style>
 </w:styles>
 </file>
 

</xml_diff>